<commit_message>
Create 8.2 and 8.3 Diagrams
</commit_message>
<xml_diff>
--- a/Sheheryar_SDS Document Code.docx
+++ b/Sheheryar_SDS Document Code.docx
@@ -46489,6 +46489,4037 @@
       </w:r>
     </w:p>
     <w:p/>
+    <w:p>
+      <w:pPr>
+        <w:pStyle w:val="Heading1"/>
+      </w:pPr>
+      <w:r>
+        <w:t>Backup &amp; Disaster Recovery Flow</w:t>
+      </w:r>
+    </w:p>
+    <w:p/>
+    <w:p>
+      <w:r>
+        <w:t>@startuml</w:t>
+      </w:r>
+    </w:p>
+    <w:p>
+      <w:proofErr w:type="gramStart"/>
+      <w:r>
+        <w:t>!theme</w:t>
+      </w:r>
+      <w:proofErr w:type="gramEnd"/>
+      <w:r>
+        <w:t xml:space="preserve"> plain</w:t>
+      </w:r>
+    </w:p>
+    <w:p>
+      <w:r>
+        <w:t>title Backup &amp; Disaster Recovery Flow Diagram – Delivery Platform System (v7.0 – Syntax Fixed)</w:t>
+      </w:r>
+    </w:p>
+    <w:p/>
+    <w:p>
+      <w:proofErr w:type="spellStart"/>
+      <w:r>
+        <w:t>skinparam</w:t>
+      </w:r>
+      <w:proofErr w:type="spellEnd"/>
+      <w:r>
+        <w:t xml:space="preserve"> </w:t>
+      </w:r>
+      <w:proofErr w:type="spellStart"/>
+      <w:r>
+        <w:t>ActivityBackgroundColor</w:t>
+      </w:r>
+      <w:proofErr w:type="spellEnd"/>
+      <w:r>
+        <w:t xml:space="preserve"> #F2F2F2</w:t>
+      </w:r>
+    </w:p>
+    <w:p>
+      <w:proofErr w:type="spellStart"/>
+      <w:r>
+        <w:t>skinparam</w:t>
+      </w:r>
+      <w:proofErr w:type="spellEnd"/>
+      <w:r>
+        <w:t xml:space="preserve"> </w:t>
+      </w:r>
+      <w:proofErr w:type="spellStart"/>
+      <w:r>
+        <w:t>ActivityBorderColor</w:t>
+      </w:r>
+      <w:proofErr w:type="spellEnd"/>
+      <w:r>
+        <w:t xml:space="preserve"> #333333</w:t>
+      </w:r>
+    </w:p>
+    <w:p>
+      <w:proofErr w:type="spellStart"/>
+      <w:r>
+        <w:t>skinparam</w:t>
+      </w:r>
+      <w:proofErr w:type="spellEnd"/>
+      <w:r>
+        <w:t xml:space="preserve"> </w:t>
+      </w:r>
+      <w:proofErr w:type="spellStart"/>
+      <w:r>
+        <w:t>ArrowColor</w:t>
+      </w:r>
+      <w:proofErr w:type="spellEnd"/>
+      <w:r>
+        <w:t xml:space="preserve"> #333333</w:t>
+      </w:r>
+    </w:p>
+    <w:p/>
+    <w:p>
+      <w:r>
+        <w:t>|Backup|</w:t>
+      </w:r>
+    </w:p>
+    <w:p>
+      <w:r>
+        <w:t>start</w:t>
+      </w:r>
+    </w:p>
+    <w:p>
+      <w:r>
+        <w:t xml:space="preserve">:Scheduled daily backup (00:00 UTC)\n- PostgreSQL WAL archiving (per microservice, read replica used to reduce load)\n- </w:t>
+      </w:r>
+      <w:proofErr w:type="spellStart"/>
+      <w:r>
+        <w:t>Velero</w:t>
+      </w:r>
+      <w:proofErr w:type="spellEnd"/>
+      <w:r>
+        <w:t xml:space="preserve"> backup of Kubernetes PVs (config, secrets, certificates)\n- Redis snapshot (optional, TTL controlled; location data loss acceptable per SEC-21)\n- Audit Log DB incremental backup (immutable, SEC-17, SEC-24)\n- Object storage (S3/Spaces – Pakistan region, encrypted at rest per SEC-12);</w:t>
+      </w:r>
+    </w:p>
+    <w:p>
+      <w:r>
+        <w:t>note right</w:t>
+      </w:r>
+    </w:p>
+    <w:p>
+      <w:r>
+        <w:t xml:space="preserve">  **RPO ≤1 hour (NFR-</w:t>
+      </w:r>
+      <w:proofErr w:type="gramStart"/>
+      <w:r>
+        <w:t>09)*</w:t>
+      </w:r>
+      <w:proofErr w:type="gramEnd"/>
+      <w:r>
+        <w:t>*</w:t>
+      </w:r>
+    </w:p>
+    <w:p>
+      <w:r>
+        <w:t xml:space="preserve">  Continuous WAL archiving for point-in-time recovery.</w:t>
+      </w:r>
+    </w:p>
+    <w:p>
+      <w:r>
+        <w:t xml:space="preserve">  Each microservice has its own database (deployment diagram, microservices architecture).</w:t>
+      </w:r>
+    </w:p>
+    <w:p>
+      <w:r>
+        <w:t xml:space="preserve">  Read replica used for backup to </w:t>
+      </w:r>
+      <w:proofErr w:type="spellStart"/>
+      <w:r>
+        <w:t>minimise</w:t>
+      </w:r>
+      <w:proofErr w:type="spellEnd"/>
+      <w:r>
+        <w:t xml:space="preserve"> primary impact.</w:t>
+      </w:r>
+    </w:p>
+    <w:p>
+      <w:r>
+        <w:t>end note</w:t>
+      </w:r>
+    </w:p>
+    <w:p>
+      <w:proofErr w:type="gramStart"/>
+      <w:r>
+        <w:t>:Retention</w:t>
+      </w:r>
+      <w:proofErr w:type="gramEnd"/>
+      <w:r>
+        <w:t xml:space="preserve">: 30 </w:t>
+      </w:r>
+      <w:proofErr w:type="gramStart"/>
+      <w:r>
+        <w:t>daily</w:t>
+      </w:r>
+      <w:proofErr w:type="gramEnd"/>
+      <w:r>
+        <w:t xml:space="preserve"> (Audit Log: 1 year minimum per SEC-24</w:t>
+      </w:r>
+      <w:proofErr w:type="gramStart"/>
+      <w:r>
+        <w:t>),\</w:t>
+      </w:r>
+      <w:proofErr w:type="gramEnd"/>
+      <w:r>
+        <w:t>n12 monthly, 7 yearly;</w:t>
+      </w:r>
+    </w:p>
+    <w:p>
+      <w:proofErr w:type="gramStart"/>
+      <w:r>
+        <w:t>:Encrypt</w:t>
+      </w:r>
+      <w:proofErr w:type="gramEnd"/>
+      <w:r>
+        <w:t xml:space="preserve"> all backups (AES-256);</w:t>
+      </w:r>
+    </w:p>
+    <w:p>
+      <w:proofErr w:type="gramStart"/>
+      <w:r>
+        <w:t>:Verify</w:t>
+      </w:r>
+      <w:proofErr w:type="gramEnd"/>
+      <w:r>
+        <w:t xml:space="preserve"> backup integrity (automated checksum);</w:t>
+      </w:r>
+    </w:p>
+    <w:p>
+      <w:r>
+        <w:t>stop</w:t>
+      </w:r>
+    </w:p>
+    <w:p/>
+    <w:p>
+      <w:r>
+        <w:t>|Monitoring &amp; Detection|</w:t>
+      </w:r>
+    </w:p>
+    <w:p>
+      <w:r>
+        <w:t>start</w:t>
+      </w:r>
+    </w:p>
+    <w:p>
+      <w:proofErr w:type="gramStart"/>
+      <w:r>
+        <w:t>:Prometheus</w:t>
+      </w:r>
+      <w:proofErr w:type="gramEnd"/>
+      <w:r>
+        <w:t xml:space="preserve"> health checks (/health per service – API contract);</w:t>
+      </w:r>
+    </w:p>
+    <w:p>
+      <w:proofErr w:type="gramStart"/>
+      <w:r>
+        <w:t>:Check</w:t>
+      </w:r>
+      <w:proofErr w:type="gramEnd"/>
+      <w:r>
+        <w:t xml:space="preserve"> critical components:\n- PostgreSQL primary &amp; replica\n- Redis cluster\n- Message broker (Kafka/</w:t>
+      </w:r>
+      <w:proofErr w:type="gramStart"/>
+      <w:r>
+        <w:t>RabbitMQ)\</w:t>
+      </w:r>
+      <w:proofErr w:type="gramEnd"/>
+      <w:r>
+        <w:t>n- Cloud storage availability\n- External payment gateway connectivity;</w:t>
+      </w:r>
+    </w:p>
+    <w:p>
+      <w:r>
+        <w:t>if (Failure detected? e.g., node down, DB corruption, region outage) then (yes)</w:t>
+      </w:r>
+    </w:p>
+    <w:p>
+      <w:r>
+        <w:t xml:space="preserve">  </w:t>
+      </w:r>
+      <w:proofErr w:type="gramStart"/>
+      <w:r>
+        <w:t>:Alert</w:t>
+      </w:r>
+      <w:proofErr w:type="gramEnd"/>
+      <w:r>
+        <w:t xml:space="preserve"> via PagerDuty/Slack (NFR-15);</w:t>
+      </w:r>
+    </w:p>
+    <w:p>
+      <w:r>
+        <w:t xml:space="preserve">  </w:t>
+      </w:r>
+      <w:proofErr w:type="gramStart"/>
+      <w:r>
+        <w:t>:Initiate</w:t>
+      </w:r>
+      <w:proofErr w:type="gramEnd"/>
+      <w:r>
+        <w:t xml:space="preserve"> disaster recovery process;</w:t>
+      </w:r>
+    </w:p>
+    <w:p>
+      <w:r>
+        <w:t>else (no)</w:t>
+      </w:r>
+    </w:p>
+    <w:p>
+      <w:r>
+        <w:t xml:space="preserve">  </w:t>
+      </w:r>
+      <w:proofErr w:type="gramStart"/>
+      <w:r>
+        <w:t>:Continue</w:t>
+      </w:r>
+      <w:proofErr w:type="gramEnd"/>
+      <w:r>
+        <w:t xml:space="preserve"> normal operation;</w:t>
+      </w:r>
+    </w:p>
+    <w:p>
+      <w:r>
+        <w:t xml:space="preserve">  stop</w:t>
+      </w:r>
+    </w:p>
+    <w:p>
+      <w:r>
+        <w:t>endif</w:t>
+      </w:r>
+    </w:p>
+    <w:p/>
+    <w:p>
+      <w:r>
+        <w:t>|Disaster Recovery Procedure|</w:t>
+      </w:r>
+    </w:p>
+    <w:p>
+      <w:r>
+        <w:t>start</w:t>
+      </w:r>
+    </w:p>
+    <w:p>
+      <w:proofErr w:type="gramStart"/>
+      <w:r>
+        <w:t>:Declare</w:t>
+      </w:r>
+      <w:proofErr w:type="gramEnd"/>
+      <w:r>
+        <w:t xml:space="preserve"> disaster (start RTO timer – target ≤4 hours per NFR-09);</w:t>
+      </w:r>
+    </w:p>
+    <w:p>
+      <w:proofErr w:type="gramStart"/>
+      <w:r>
+        <w:t>:</w:t>
+      </w:r>
+      <w:r>
+        <w:rPr>
+          <w:rFonts w:ascii="Segoe UI Emoji" w:hAnsi="Segoe UI Emoji" w:cs="Segoe UI Emoji"/>
+        </w:rPr>
+        <w:t>🚦</w:t>
+      </w:r>
+      <w:proofErr w:type="gramEnd"/>
+      <w:r>
+        <w:t xml:space="preserve"> Suspend incoming traffic (DNS cutover to standby cluster or static maintenance page);</w:t>
+      </w:r>
+    </w:p>
+    <w:p>
+      <w:proofErr w:type="gramStart"/>
+      <w:r>
+        <w:t>:</w:t>
+      </w:r>
+      <w:r>
+        <w:rPr>
+          <w:rFonts w:ascii="Segoe UI Emoji" w:hAnsi="Segoe UI Emoji" w:cs="Segoe UI Emoji"/>
+        </w:rPr>
+        <w:t>🔁</w:t>
+      </w:r>
+      <w:proofErr w:type="gramEnd"/>
+      <w:r>
+        <w:t xml:space="preserve"> Restore each PostgreSQL database from latest WAL (point-in-time consistent across services – requires application-level reconciliation using outbox pattern / saga replay, per Microservices Architecture 3.8.4);</w:t>
+      </w:r>
+    </w:p>
+    <w:p>
+      <w:proofErr w:type="gramStart"/>
+      <w:r>
+        <w:t>:</w:t>
+      </w:r>
+      <w:r>
+        <w:rPr>
+          <w:rFonts w:ascii="Segoe UI Emoji" w:hAnsi="Segoe UI Emoji" w:cs="Segoe UI Emoji"/>
+        </w:rPr>
+        <w:t>💾</w:t>
+      </w:r>
+      <w:proofErr w:type="gramEnd"/>
+      <w:r>
+        <w:t xml:space="preserve"> Restore Kubernetes persistent volumes (</w:t>
+      </w:r>
+      <w:proofErr w:type="spellStart"/>
+      <w:r>
+        <w:t>Velero</w:t>
+      </w:r>
+      <w:proofErr w:type="spellEnd"/>
+      <w:r>
+        <w:t>) – includes configuration, secrets, certificates;</w:t>
+      </w:r>
+    </w:p>
+    <w:p>
+      <w:proofErr w:type="gramStart"/>
+      <w:r>
+        <w:t>:</w:t>
+      </w:r>
+      <w:r>
+        <w:rPr>
+          <w:rFonts w:ascii="Segoe UI Emoji" w:hAnsi="Segoe UI Emoji" w:cs="Segoe UI Emoji"/>
+        </w:rPr>
+        <w:t>📜</w:t>
+      </w:r>
+      <w:proofErr w:type="gramEnd"/>
+      <w:r>
+        <w:t xml:space="preserve"> Restore Audit Log DB (immutable – verify hash chain integrity, SEC-17);</w:t>
+      </w:r>
+    </w:p>
+    <w:p>
+      <w:proofErr w:type="gramStart"/>
+      <w:r>
+        <w:t>:</w:t>
+      </w:r>
+      <w:r>
+        <w:rPr>
+          <w:rFonts w:ascii="Segoe UI Emoji" w:hAnsi="Segoe UI Emoji" w:cs="Segoe UI Emoji"/>
+        </w:rPr>
+        <w:t>📁</w:t>
+      </w:r>
+      <w:proofErr w:type="gramEnd"/>
+      <w:r>
+        <w:t xml:space="preserve"> Restore Cloud Storage metadata (images, bills, legal agreements) – verify integrity;</w:t>
+      </w:r>
+    </w:p>
+    <w:p>
+      <w:proofErr w:type="gramStart"/>
+      <w:r>
+        <w:t>:</w:t>
+      </w:r>
+      <w:r>
+        <w:rPr>
+          <w:rFonts w:ascii="Segoe UI Emoji" w:hAnsi="Segoe UI Emoji" w:cs="Segoe UI Emoji"/>
+        </w:rPr>
+        <w:t>🗄</w:t>
+      </w:r>
+      <w:proofErr w:type="gramEnd"/>
+      <w:r>
+        <w:rPr>
+          <w:rFonts w:ascii="Segoe UI Emoji" w:hAnsi="Segoe UI Emoji" w:cs="Segoe UI Emoji"/>
+        </w:rPr>
+        <w:t>️</w:t>
+      </w:r>
+      <w:r>
+        <w:t xml:space="preserve"> Handle Redis decision;</w:t>
+      </w:r>
+    </w:p>
+    <w:p>
+      <w:r>
+        <w:t>if (Restore location data from Redis snapshot?) then (yes)</w:t>
+      </w:r>
+    </w:p>
+    <w:p>
+      <w:r>
+        <w:t xml:space="preserve">  </w:t>
+      </w:r>
+      <w:proofErr w:type="gramStart"/>
+      <w:r>
+        <w:t>:Restore</w:t>
+      </w:r>
+      <w:proofErr w:type="gramEnd"/>
+      <w:r>
+        <w:t xml:space="preserve"> from last snapshot (note: 24h retention – SEC-21, loss acceptable);</w:t>
+      </w:r>
+    </w:p>
+    <w:p>
+      <w:r>
+        <w:t>else (no)</w:t>
+      </w:r>
+    </w:p>
+    <w:p>
+      <w:r>
+        <w:t xml:space="preserve">  </w:t>
+      </w:r>
+      <w:proofErr w:type="gramStart"/>
+      <w:r>
+        <w:t>:Start</w:t>
+      </w:r>
+      <w:proofErr w:type="gramEnd"/>
+      <w:r>
+        <w:t xml:space="preserve"> empty Redis cluster;</w:t>
+      </w:r>
+    </w:p>
+    <w:p>
+      <w:r>
+        <w:t>endif</w:t>
+      </w:r>
+    </w:p>
+    <w:p>
+      <w:proofErr w:type="gramStart"/>
+      <w:r>
+        <w:t>:</w:t>
+      </w:r>
+      <w:r>
+        <w:rPr>
+          <w:rFonts w:ascii="Segoe UI Emoji" w:hAnsi="Segoe UI Emoji" w:cs="Segoe UI Emoji"/>
+        </w:rPr>
+        <w:t>📨</w:t>
+      </w:r>
+      <w:proofErr w:type="gramEnd"/>
+      <w:r>
+        <w:t xml:space="preserve"> Replay missed events from Kafka/RabbitMQ (event bus retains last 7 days</w:t>
+      </w:r>
+      <w:proofErr w:type="gramStart"/>
+      <w:r>
+        <w:t>);\</w:t>
+      </w:r>
+      <w:proofErr w:type="gramEnd"/>
+      <w:r>
+        <w:t>n- Orders, trips, payment confirmations re</w:t>
+      </w:r>
+      <w:r>
+        <w:rPr>
+          <w:rFonts w:ascii="Cambria Math" w:hAnsi="Cambria Math" w:cs="Cambria Math"/>
+        </w:rPr>
+        <w:t>‑</w:t>
+      </w:r>
+      <w:r>
+        <w:t>processed (idempotent handlers);</w:t>
+      </w:r>
+    </w:p>
+    <w:p>
+      <w:proofErr w:type="gramStart"/>
+      <w:r>
+        <w:t>:</w:t>
+      </w:r>
+      <w:r>
+        <w:rPr>
+          <w:rFonts w:ascii="Segoe UI Emoji" w:hAnsi="Segoe UI Emoji" w:cs="Segoe UI Emoji"/>
+        </w:rPr>
+        <w:t>💳</w:t>
+      </w:r>
+      <w:proofErr w:type="gramEnd"/>
+      <w:r>
+        <w:t xml:space="preserve"> Reconcile payment state with external gateways (Stripe/</w:t>
+      </w:r>
+      <w:proofErr w:type="spellStart"/>
+      <w:r>
+        <w:t>Easypaisa</w:t>
+      </w:r>
+      <w:proofErr w:type="spellEnd"/>
+      <w:r>
+        <w:t>/</w:t>
+      </w:r>
+      <w:proofErr w:type="spellStart"/>
+      <w:r>
+        <w:t>Jazzcash</w:t>
+      </w:r>
+      <w:proofErr w:type="spellEnd"/>
+      <w:r>
+        <w:t>) using transaction logs (UC4, UC29);</w:t>
+      </w:r>
+    </w:p>
+    <w:p>
+      <w:r>
+        <w:t>:</w:t>
+      </w:r>
+      <w:r>
+        <w:rPr>
+          <w:rFonts w:ascii="Segoe UI Emoji" w:hAnsi="Segoe UI Emoji" w:cs="Segoe UI Emoji"/>
+        </w:rPr>
+        <w:t>⏰</w:t>
+      </w:r>
+      <w:r>
+        <w:t xml:space="preserve"> Resume scheduled jobs (Quartz) </w:t>
+      </w:r>
+      <w:r>
+        <w:rPr>
+          <w:rFonts w:ascii="Calibri" w:hAnsi="Calibri" w:cs="Calibri"/>
+        </w:rPr>
+        <w:t>–</w:t>
+      </w:r>
+      <w:r>
+        <w:t xml:space="preserve"> discount activation, profit reminders from last checkpoint;</w:t>
+      </w:r>
+    </w:p>
+    <w:p>
+      <w:proofErr w:type="gramStart"/>
+      <w:r>
+        <w:t>:</w:t>
+      </w:r>
+      <w:r>
+        <w:rPr>
+          <w:rFonts w:ascii="Segoe UI Emoji" w:hAnsi="Segoe UI Emoji" w:cs="Segoe UI Emoji"/>
+        </w:rPr>
+        <w:t>✅</w:t>
+      </w:r>
+      <w:proofErr w:type="gramEnd"/>
+      <w:r>
+        <w:t xml:space="preserve"> Perform smoke tests on critical paths:\n- POST /order/pay (UC</w:t>
+      </w:r>
+      <w:proofErr w:type="gramStart"/>
+      <w:r>
+        <w:t>4)\</w:t>
+      </w:r>
+      <w:proofErr w:type="gramEnd"/>
+      <w:r>
+        <w:t>n- POST /trip/start (UC</w:t>
+      </w:r>
+      <w:proofErr w:type="gramStart"/>
+      <w:r>
+        <w:t>13)\</w:t>
+      </w:r>
+      <w:proofErr w:type="gramEnd"/>
+      <w:r>
+        <w:t>n- GET /dispatch/available-orders (UC</w:t>
+      </w:r>
+      <w:proofErr w:type="gramStart"/>
+      <w:r>
+        <w:t>12)\</w:t>
+      </w:r>
+      <w:proofErr w:type="gramEnd"/>
+      <w:r>
+        <w:t>n- POST /auth/login (UC2) with MFA;</w:t>
+      </w:r>
+    </w:p>
+    <w:p>
+      <w:proofErr w:type="gramStart"/>
+      <w:r>
+        <w:t>:</w:t>
+      </w:r>
+      <w:r>
+        <w:rPr>
+          <w:rFonts w:ascii="Segoe UI Emoji" w:hAnsi="Segoe UI Emoji" w:cs="Segoe UI Emoji"/>
+        </w:rPr>
+        <w:t>🌐</w:t>
+      </w:r>
+      <w:proofErr w:type="gramEnd"/>
+      <w:r>
+        <w:t xml:space="preserve"> Switch DNS to recovered cluster;</w:t>
+      </w:r>
+    </w:p>
+    <w:p>
+      <w:proofErr w:type="gramStart"/>
+      <w:r>
+        <w:t>:</w:t>
+      </w:r>
+      <w:r>
+        <w:rPr>
+          <w:rFonts w:ascii="Segoe UI Emoji" w:hAnsi="Segoe UI Emoji" w:cs="Segoe UI Emoji"/>
+        </w:rPr>
+        <w:t>📈</w:t>
+      </w:r>
+      <w:proofErr w:type="gramEnd"/>
+      <w:r>
+        <w:t xml:space="preserve"> Resume traffic;</w:t>
+      </w:r>
+    </w:p>
+    <w:p>
+      <w:proofErr w:type="gramStart"/>
+      <w:r>
+        <w:t>:</w:t>
+      </w:r>
+      <w:r>
+        <w:rPr>
+          <w:rFonts w:ascii="Segoe UI Emoji" w:hAnsi="Segoe UI Emoji" w:cs="Segoe UI Emoji"/>
+        </w:rPr>
+        <w:t>📝</w:t>
+      </w:r>
+      <w:proofErr w:type="gramEnd"/>
+      <w:r>
+        <w:t xml:space="preserve"> Post</w:t>
+      </w:r>
+      <w:r>
+        <w:rPr>
+          <w:rFonts w:ascii="Cambria Math" w:hAnsi="Cambria Math" w:cs="Cambria Math"/>
+        </w:rPr>
+        <w:t>‑</w:t>
+      </w:r>
+      <w:r>
+        <w:t>mortem report (root cause, recovery time, data loss);</w:t>
+      </w:r>
+    </w:p>
+    <w:p>
+      <w:proofErr w:type="gramStart"/>
+      <w:r>
+        <w:t>:Schedule</w:t>
+      </w:r>
+      <w:proofErr w:type="gramEnd"/>
+      <w:r>
+        <w:t xml:space="preserve"> annual DR drill (industry best practice);</w:t>
+      </w:r>
+    </w:p>
+    <w:p>
+      <w:r>
+        <w:t>stop</w:t>
+      </w:r>
+    </w:p>
+    <w:p/>
+    <w:p>
+      <w:r>
+        <w:t>|Recovery Objectives|</w:t>
+      </w:r>
+    </w:p>
+    <w:p>
+      <w:r>
+        <w:t>note right</w:t>
+      </w:r>
+    </w:p>
+    <w:p>
+      <w:r>
+        <w:t xml:space="preserve">  **RTO ≤4 hours (NFR-</w:t>
+      </w:r>
+      <w:proofErr w:type="gramStart"/>
+      <w:r>
+        <w:t>09)*</w:t>
+      </w:r>
+      <w:proofErr w:type="gramEnd"/>
+      <w:r>
+        <w:t>*</w:t>
+      </w:r>
+    </w:p>
+    <w:p>
+      <w:r>
+        <w:t xml:space="preserve">  **RPO ≤1 hour (NFR-</w:t>
+      </w:r>
+      <w:proofErr w:type="gramStart"/>
+      <w:r>
+        <w:t>09)*</w:t>
+      </w:r>
+      <w:proofErr w:type="gramEnd"/>
+      <w:r>
+        <w:t>*</w:t>
+      </w:r>
+    </w:p>
+    <w:p>
+      <w:r>
+        <w:t xml:space="preserve">  **99.9% uptime for ordering/payment (NFR-</w:t>
+      </w:r>
+      <w:proofErr w:type="gramStart"/>
+      <w:r>
+        <w:t>08)*</w:t>
+      </w:r>
+      <w:proofErr w:type="gramEnd"/>
+      <w:r>
+        <w:t>*</w:t>
+      </w:r>
+    </w:p>
+    <w:p>
+      <w:r>
+        <w:t xml:space="preserve">  Cross</w:t>
+      </w:r>
+      <w:r>
+        <w:rPr>
+          <w:rFonts w:ascii="Cambria Math" w:hAnsi="Cambria Math" w:cs="Cambria Math"/>
+        </w:rPr>
+        <w:t>‑</w:t>
+      </w:r>
+      <w:r>
+        <w:t>service consistency via Saga replay (Microservices Architecture 3.8.4)</w:t>
+      </w:r>
+    </w:p>
+    <w:p>
+      <w:r>
+        <w:t xml:space="preserve">  Backups stored in Pakistan region (NFR-21)</w:t>
+      </w:r>
+    </w:p>
+    <w:p>
+      <w:r>
+        <w:t xml:space="preserve">  Immutable audit log preserved (SEC-17, SEC-24)</w:t>
+      </w:r>
+    </w:p>
+    <w:p>
+      <w:r>
+        <w:t xml:space="preserve">  Location data loss during Redis restore is acceptable per SEC-21</w:t>
+      </w:r>
+    </w:p>
+    <w:p>
+      <w:r>
+        <w:t xml:space="preserve">  DR plan tested annually (not in SRS but added as best practice)</w:t>
+      </w:r>
+    </w:p>
+    <w:p>
+      <w:r>
+        <w:t>end note</w:t>
+      </w:r>
+    </w:p>
+    <w:p/>
+    <w:p>
+      <w:r>
+        <w:t>@enduml</w:t>
+      </w:r>
+    </w:p>
+    <w:p/>
+    <w:p>
+      <w:pPr>
+        <w:pStyle w:val="Heading1"/>
+      </w:pPr>
+      <w:r>
+        <w:t>Monitoring &amp; Alerting Architecture</w:t>
+      </w:r>
+    </w:p>
+    <w:p/>
+    <w:p>
+      <w:r>
+        <w:t>@startuml</w:t>
+      </w:r>
+    </w:p>
+    <w:p>
+      <w:proofErr w:type="gramStart"/>
+      <w:r>
+        <w:t>!theme</w:t>
+      </w:r>
+      <w:proofErr w:type="gramEnd"/>
+      <w:r>
+        <w:t xml:space="preserve"> plain</w:t>
+      </w:r>
+    </w:p>
+    <w:p>
+      <w:r>
+        <w:t>title Monitoring &amp; Alerting Architecture – Delivery Platform System (v11.0 – Final)</w:t>
+      </w:r>
+    </w:p>
+    <w:p/>
+    <w:p>
+      <w:proofErr w:type="spellStart"/>
+      <w:r>
+        <w:t>skinparam</w:t>
+      </w:r>
+      <w:proofErr w:type="spellEnd"/>
+      <w:r>
+        <w:t xml:space="preserve"> component {</w:t>
+      </w:r>
+    </w:p>
+    <w:p>
+      <w:r>
+        <w:t xml:space="preserve">  </w:t>
+      </w:r>
+      <w:proofErr w:type="spellStart"/>
+      <w:r>
+        <w:t>BackgroundColor</w:t>
+      </w:r>
+      <w:proofErr w:type="spellEnd"/>
+      <w:r>
+        <w:t xml:space="preserve"> #F2F2F2</w:t>
+      </w:r>
+    </w:p>
+    <w:p>
+      <w:r>
+        <w:t xml:space="preserve">  </w:t>
+      </w:r>
+      <w:proofErr w:type="spellStart"/>
+      <w:r>
+        <w:t>BorderColor</w:t>
+      </w:r>
+      <w:proofErr w:type="spellEnd"/>
+      <w:r>
+        <w:t xml:space="preserve"> #333333</w:t>
+      </w:r>
+    </w:p>
+    <w:p>
+      <w:r>
+        <w:t>}</w:t>
+      </w:r>
+    </w:p>
+    <w:p>
+      <w:proofErr w:type="spellStart"/>
+      <w:r>
+        <w:t>skinparam</w:t>
+      </w:r>
+      <w:proofErr w:type="spellEnd"/>
+      <w:r>
+        <w:t xml:space="preserve"> database {</w:t>
+      </w:r>
+    </w:p>
+    <w:p>
+      <w:r>
+        <w:t xml:space="preserve">  </w:t>
+      </w:r>
+      <w:proofErr w:type="spellStart"/>
+      <w:r>
+        <w:t>BackgroundColor</w:t>
+      </w:r>
+      <w:proofErr w:type="spellEnd"/>
+      <w:r>
+        <w:t xml:space="preserve"> #E6F4EA</w:t>
+      </w:r>
+    </w:p>
+    <w:p>
+      <w:r>
+        <w:t xml:space="preserve">  </w:t>
+      </w:r>
+      <w:proofErr w:type="spellStart"/>
+      <w:r>
+        <w:t>BorderColor</w:t>
+      </w:r>
+      <w:proofErr w:type="spellEnd"/>
+      <w:r>
+        <w:t xml:space="preserve"> #137333</w:t>
+      </w:r>
+    </w:p>
+    <w:p>
+      <w:r>
+        <w:t>}</w:t>
+      </w:r>
+    </w:p>
+    <w:p>
+      <w:proofErr w:type="spellStart"/>
+      <w:r>
+        <w:t>skinparam</w:t>
+      </w:r>
+      <w:proofErr w:type="spellEnd"/>
+      <w:r>
+        <w:t xml:space="preserve"> node {</w:t>
+      </w:r>
+    </w:p>
+    <w:p>
+      <w:r>
+        <w:t xml:space="preserve">  </w:t>
+      </w:r>
+      <w:proofErr w:type="spellStart"/>
+      <w:r>
+        <w:t>BackgroundColor</w:t>
+      </w:r>
+      <w:proofErr w:type="spellEnd"/>
+      <w:r>
+        <w:t xml:space="preserve"> #E8F0FE</w:t>
+      </w:r>
+    </w:p>
+    <w:p>
+      <w:r>
+        <w:t xml:space="preserve">  </w:t>
+      </w:r>
+      <w:proofErr w:type="spellStart"/>
+      <w:r>
+        <w:t>BorderColor</w:t>
+      </w:r>
+      <w:proofErr w:type="spellEnd"/>
+      <w:r>
+        <w:t xml:space="preserve"> #1A73E8</w:t>
+      </w:r>
+    </w:p>
+    <w:p>
+      <w:r>
+        <w:t>}</w:t>
+      </w:r>
+    </w:p>
+    <w:p>
+      <w:proofErr w:type="spellStart"/>
+      <w:r>
+        <w:t>skinparam</w:t>
+      </w:r>
+      <w:proofErr w:type="spellEnd"/>
+      <w:r>
+        <w:t xml:space="preserve"> actor {</w:t>
+      </w:r>
+    </w:p>
+    <w:p>
+      <w:r>
+        <w:t xml:space="preserve">  </w:t>
+      </w:r>
+      <w:proofErr w:type="spellStart"/>
+      <w:r>
+        <w:t>BackgroundColor</w:t>
+      </w:r>
+      <w:proofErr w:type="spellEnd"/>
+      <w:r>
+        <w:t xml:space="preserve"> #FCE8E6</w:t>
+      </w:r>
+    </w:p>
+    <w:p>
+      <w:r>
+        <w:t xml:space="preserve">  </w:t>
+      </w:r>
+      <w:proofErr w:type="spellStart"/>
+      <w:r>
+        <w:t>BorderColor</w:t>
+      </w:r>
+      <w:proofErr w:type="spellEnd"/>
+      <w:r>
+        <w:t xml:space="preserve"> #D93025</w:t>
+      </w:r>
+    </w:p>
+    <w:p>
+      <w:r>
+        <w:t>}</w:t>
+      </w:r>
+    </w:p>
+    <w:p>
+      <w:proofErr w:type="spellStart"/>
+      <w:r>
+        <w:t>skinparam</w:t>
+      </w:r>
+      <w:proofErr w:type="spellEnd"/>
+      <w:r>
+        <w:t xml:space="preserve"> queue {</w:t>
+      </w:r>
+    </w:p>
+    <w:p>
+      <w:r>
+        <w:t xml:space="preserve">  </w:t>
+      </w:r>
+      <w:proofErr w:type="spellStart"/>
+      <w:r>
+        <w:t>BackgroundColor</w:t>
+      </w:r>
+      <w:proofErr w:type="spellEnd"/>
+      <w:r>
+        <w:t xml:space="preserve"> #FFF3E0</w:t>
+      </w:r>
+    </w:p>
+    <w:p>
+      <w:r>
+        <w:t xml:space="preserve">  </w:t>
+      </w:r>
+      <w:proofErr w:type="spellStart"/>
+      <w:r>
+        <w:t>BorderColor</w:t>
+      </w:r>
+      <w:proofErr w:type="spellEnd"/>
+      <w:r>
+        <w:t xml:space="preserve"> #FF9800</w:t>
+      </w:r>
+    </w:p>
+    <w:p>
+      <w:r>
+        <w:t>}</w:t>
+      </w:r>
+    </w:p>
+    <w:p/>
+    <w:p>
+      <w:r>
+        <w:t>' ============================</w:t>
+      </w:r>
+    </w:p>
+    <w:p>
+      <w:r>
+        <w:t>' Monitored Components (Deployment, Network, Microservices)</w:t>
+      </w:r>
+    </w:p>
+    <w:p>
+      <w:r>
+        <w:t>' ============================</w:t>
+      </w:r>
+    </w:p>
+    <w:p>
+      <w:r>
+        <w:t>package "Monitored Components" {</w:t>
+      </w:r>
+    </w:p>
+    <w:p>
+      <w:r>
+        <w:t xml:space="preserve">  </w:t>
+      </w:r>
+    </w:p>
+    <w:p>
+      <w:r>
+        <w:t xml:space="preserve">  node "Load Balancer\</w:t>
+      </w:r>
+      <w:proofErr w:type="gramStart"/>
+      <w:r>
+        <w:t>n(</w:t>
+      </w:r>
+      <w:proofErr w:type="gramEnd"/>
+      <w:r>
+        <w:t>Nginx / AWS ALB)" as LB</w:t>
+      </w:r>
+    </w:p>
+    <w:p>
+      <w:r>
+        <w:t xml:space="preserve">  node "Firewall / WAF" as FW</w:t>
+      </w:r>
+    </w:p>
+    <w:p>
+      <w:r>
+        <w:t xml:space="preserve">  node "API Gateway\</w:t>
+      </w:r>
+      <w:proofErr w:type="gramStart"/>
+      <w:r>
+        <w:t>n(</w:t>
+      </w:r>
+      <w:proofErr w:type="gramEnd"/>
+      <w:r>
+        <w:t>Spring Cloud Gateway)" as Gateway</w:t>
+      </w:r>
+    </w:p>
+    <w:p>
+      <w:r>
+        <w:t xml:space="preserve">  </w:t>
+      </w:r>
+    </w:p>
+    <w:p>
+      <w:r>
+        <w:t xml:space="preserve">  node "Kubernetes Cluster" as K8s {</w:t>
+      </w:r>
+    </w:p>
+    <w:p>
+      <w:r>
+        <w:t xml:space="preserve">    node "Cluster Infrastructure" as K8sInfra {</w:t>
+      </w:r>
+    </w:p>
+    <w:p>
+      <w:r>
+        <w:t xml:space="preserve">      component [</w:t>
+      </w:r>
+      <w:proofErr w:type="spellStart"/>
+      <w:r>
+        <w:t>kube</w:t>
+      </w:r>
+      <w:proofErr w:type="spellEnd"/>
+      <w:r>
+        <w:t>-state-metrics] as KSM</w:t>
+      </w:r>
+    </w:p>
+    <w:p>
+      <w:r>
+        <w:t xml:space="preserve">      component [node-exporter] as </w:t>
+      </w:r>
+      <w:proofErr w:type="spellStart"/>
+      <w:r>
+        <w:t>NodeExp</w:t>
+      </w:r>
+      <w:proofErr w:type="spellEnd"/>
+    </w:p>
+    <w:p>
+      <w:r>
+        <w:t xml:space="preserve">    }</w:t>
+      </w:r>
+    </w:p>
+    <w:p>
+      <w:r>
+        <w:t xml:space="preserve">    node "Core Services" as Core {</w:t>
+      </w:r>
+    </w:p>
+    <w:p>
+      <w:r>
+        <w:t xml:space="preserve">      component [Customer Service] as Cust</w:t>
+      </w:r>
+    </w:p>
+    <w:p>
+      <w:r>
+        <w:t xml:space="preserve">      component [Rider Service] as Rider</w:t>
+      </w:r>
+    </w:p>
+    <w:p>
+      <w:r>
+        <w:t xml:space="preserve">      component [Order Service] as Order</w:t>
+      </w:r>
+    </w:p>
+    <w:p>
+      <w:r>
+        <w:t xml:space="preserve">      component [Trip &amp; Route Service] as Trip</w:t>
+      </w:r>
+    </w:p>
+    <w:p>
+      <w:r>
+        <w:t xml:space="preserve">      component [Dispatch Service] as Dispatch</w:t>
+      </w:r>
+    </w:p>
+    <w:p>
+      <w:r>
+        <w:t xml:space="preserve">      component [Product &amp; Shop Service] as Product</w:t>
+      </w:r>
+    </w:p>
+    <w:p>
+      <w:r>
+        <w:t xml:space="preserve">      component [Client &amp; Config Service] as Client</w:t>
+      </w:r>
+    </w:p>
+    <w:p>
+      <w:r>
+        <w:t xml:space="preserve">    }</w:t>
+      </w:r>
+    </w:p>
+    <w:p>
+      <w:r>
+        <w:t xml:space="preserve">    node "Financial Services" as Fin {</w:t>
+      </w:r>
+    </w:p>
+    <w:p>
+      <w:r>
+        <w:t xml:space="preserve">      component [Financial Reporting] as Finance</w:t>
+      </w:r>
+    </w:p>
+    <w:p>
+      <w:r>
+        <w:t xml:space="preserve">      component [Payment Gateway Service] as Payment</w:t>
+      </w:r>
+    </w:p>
+    <w:p>
+      <w:r>
+        <w:t xml:space="preserve">      component [Discount Engine] as Discount</w:t>
+      </w:r>
+    </w:p>
+    <w:p>
+      <w:r>
+        <w:t xml:space="preserve">    }</w:t>
+      </w:r>
+    </w:p>
+    <w:p>
+      <w:r>
+        <w:t xml:space="preserve">    node "Support Services" as Supp {</w:t>
+      </w:r>
+    </w:p>
+    <w:p>
+      <w:r>
+        <w:t xml:space="preserve">      component [Notification Service] as Notify</w:t>
+      </w:r>
+    </w:p>
+    <w:p>
+      <w:r>
+        <w:t xml:space="preserve">      component [Complaint &amp; Return] as Complaint</w:t>
+      </w:r>
+    </w:p>
+    <w:p>
+      <w:r>
+        <w:t xml:space="preserve">      component [Receipt Generator] as Receipt</w:t>
+      </w:r>
+    </w:p>
+    <w:p>
+      <w:r>
+        <w:t xml:space="preserve">      component [Scheduled Jobs (Quartz)] as Scheduler</w:t>
+      </w:r>
+    </w:p>
+    <w:p>
+      <w:r>
+        <w:t xml:space="preserve">    }</w:t>
+      </w:r>
+    </w:p>
+    <w:p>
+      <w:r>
+        <w:t xml:space="preserve">  }</w:t>
+      </w:r>
+    </w:p>
+    <w:p>
+      <w:r>
+        <w:t xml:space="preserve">  </w:t>
+      </w:r>
+    </w:p>
+    <w:p>
+      <w:r>
+        <w:t xml:space="preserve">  database "PostgreSQL (per </w:t>
+      </w:r>
+      <w:proofErr w:type="gramStart"/>
+      <w:r>
+        <w:t>service)\</w:t>
+      </w:r>
+      <w:proofErr w:type="gramEnd"/>
+      <w:r>
+        <w:t>n+ Read Replica (product cache)" as Postgres</w:t>
+      </w:r>
+    </w:p>
+    <w:p>
+      <w:r>
+        <w:t xml:space="preserve">  database "Redis Cluster\</w:t>
+      </w:r>
+      <w:proofErr w:type="gramStart"/>
+      <w:r>
+        <w:t>n(</w:t>
+      </w:r>
+      <w:proofErr w:type="gramEnd"/>
+      <w:r>
+        <w:t>Live locations / sessions)" as Redis</w:t>
+      </w:r>
+    </w:p>
+    <w:p>
+      <w:r>
+        <w:t xml:space="preserve">  database "Audit Log DB\</w:t>
+      </w:r>
+      <w:proofErr w:type="gramStart"/>
+      <w:r>
+        <w:t>n(</w:t>
+      </w:r>
+      <w:proofErr w:type="gramEnd"/>
+      <w:r>
+        <w:t xml:space="preserve">Immutable, SEC-17/24)" as </w:t>
+      </w:r>
+      <w:proofErr w:type="spellStart"/>
+      <w:r>
+        <w:t>AuditDB</w:t>
+      </w:r>
+      <w:proofErr w:type="spellEnd"/>
+    </w:p>
+    <w:p>
+      <w:r>
+        <w:t xml:space="preserve">  queue "Message Broker\</w:t>
+      </w:r>
+      <w:proofErr w:type="gramStart"/>
+      <w:r>
+        <w:t>n(</w:t>
+      </w:r>
+      <w:proofErr w:type="gramEnd"/>
+      <w:r>
+        <w:t xml:space="preserve">Kafka / RabbitMQ)" as </w:t>
+      </w:r>
+      <w:proofErr w:type="spellStart"/>
+      <w:r>
+        <w:t>EventBus</w:t>
+      </w:r>
+      <w:proofErr w:type="spellEnd"/>
+    </w:p>
+    <w:p>
+      <w:r>
+        <w:t xml:space="preserve">  database "Cloud Storage\</w:t>
+      </w:r>
+      <w:proofErr w:type="gramStart"/>
+      <w:r>
+        <w:t>n(</w:t>
+      </w:r>
+      <w:proofErr w:type="gramEnd"/>
+      <w:r>
+        <w:t>S3 / Spaces, Pakistan region)" as Storage</w:t>
+      </w:r>
+    </w:p>
+    <w:p>
+      <w:r>
+        <w:t xml:space="preserve">  </w:t>
+      </w:r>
+    </w:p>
+    <w:p>
+      <w:r>
+        <w:t xml:space="preserve">  node "External Services" as Ext {</w:t>
+      </w:r>
+    </w:p>
+    <w:p>
+      <w:r>
+        <w:t xml:space="preserve">    component [Google Maps API] as Maps</w:t>
+      </w:r>
+    </w:p>
+    <w:p>
+      <w:r>
+        <w:t xml:space="preserve">    component [Payment Gateway\n(Stripe/</w:t>
+      </w:r>
+      <w:proofErr w:type="spellStart"/>
+      <w:r>
+        <w:t>Easypaisa</w:t>
+      </w:r>
+      <w:proofErr w:type="spellEnd"/>
+      <w:r>
+        <w:t>/</w:t>
+      </w:r>
+      <w:proofErr w:type="spellStart"/>
+      <w:r>
+        <w:t>Jazzcash</w:t>
+      </w:r>
+      <w:proofErr w:type="spellEnd"/>
+      <w:r>
+        <w:t xml:space="preserve">)] as </w:t>
+      </w:r>
+      <w:proofErr w:type="spellStart"/>
+      <w:r>
+        <w:t>PayExt</w:t>
+      </w:r>
+      <w:proofErr w:type="spellEnd"/>
+    </w:p>
+    <w:p>
+      <w:r>
+        <w:t xml:space="preserve">    component [SMS/Email\n(Twilio/SendGrid)] as </w:t>
+      </w:r>
+      <w:proofErr w:type="spellStart"/>
+      <w:r>
+        <w:t>MsgExt</w:t>
+      </w:r>
+      <w:proofErr w:type="spellEnd"/>
+    </w:p>
+    <w:p>
+      <w:r>
+        <w:t xml:space="preserve">  }</w:t>
+      </w:r>
+    </w:p>
+    <w:p>
+      <w:r>
+        <w:t>}</w:t>
+      </w:r>
+    </w:p>
+    <w:p/>
+    <w:p>
+      <w:r>
+        <w:t>' ============================</w:t>
+      </w:r>
+    </w:p>
+    <w:p>
+      <w:r>
+        <w:t>' Monitoring &amp; Alerting Stack (Tech Stack + NFR-15)</w:t>
+      </w:r>
+    </w:p>
+    <w:p>
+      <w:r>
+        <w:t>' ============================</w:t>
+      </w:r>
+    </w:p>
+    <w:p>
+      <w:r>
+        <w:t>package "Monitoring &amp; Alerting Stack" {</w:t>
+      </w:r>
+    </w:p>
+    <w:p>
+      <w:r>
+        <w:t xml:space="preserve">  component "Prometheus\</w:t>
+      </w:r>
+      <w:proofErr w:type="gramStart"/>
+      <w:r>
+        <w:t>n(</w:t>
+      </w:r>
+      <w:proofErr w:type="gramEnd"/>
+      <w:r>
+        <w:t>Metrics Scraper)" as Prom</w:t>
+      </w:r>
+    </w:p>
+    <w:p>
+      <w:r>
+        <w:t xml:space="preserve">  component "</w:t>
+      </w:r>
+      <w:proofErr w:type="spellStart"/>
+      <w:r>
+        <w:t>Alertmanager</w:t>
+      </w:r>
+      <w:proofErr w:type="spellEnd"/>
+      <w:r>
+        <w:t>" as AM</w:t>
+      </w:r>
+    </w:p>
+    <w:p>
+      <w:r>
+        <w:t xml:space="preserve">  component "Grafana\n(Dashboards)" as Graf</w:t>
+      </w:r>
+    </w:p>
+    <w:p>
+      <w:r>
+        <w:t xml:space="preserve">  component "ELK Stack\</w:t>
+      </w:r>
+      <w:proofErr w:type="gramStart"/>
+      <w:r>
+        <w:t>n(</w:t>
+      </w:r>
+      <w:proofErr w:type="gramEnd"/>
+      <w:r>
+        <w:t xml:space="preserve">Logs via </w:t>
+      </w:r>
+      <w:proofErr w:type="spellStart"/>
+      <w:r>
+        <w:t>Filebeat</w:t>
+      </w:r>
+      <w:proofErr w:type="spellEnd"/>
+      <w:r>
+        <w:t>)" as ELK</w:t>
+      </w:r>
+    </w:p>
+    <w:p>
+      <w:r>
+        <w:t xml:space="preserve">  component "Jaeger\</w:t>
+      </w:r>
+      <w:proofErr w:type="gramStart"/>
+      <w:r>
+        <w:t>n(</w:t>
+      </w:r>
+      <w:proofErr w:type="gramEnd"/>
+      <w:r>
+        <w:t>Distributed Tracing)" as Jaeger</w:t>
+      </w:r>
+    </w:p>
+    <w:p>
+      <w:r>
+        <w:t xml:space="preserve">  component "PagerDuty / Slack\</w:t>
+      </w:r>
+      <w:proofErr w:type="gramStart"/>
+      <w:r>
+        <w:t>n(</w:t>
+      </w:r>
+      <w:proofErr w:type="gramEnd"/>
+      <w:r>
+        <w:t>External Alerts)" as PD</w:t>
+      </w:r>
+    </w:p>
+    <w:p>
+      <w:r>
+        <w:t>}</w:t>
+      </w:r>
+    </w:p>
+    <w:p/>
+    <w:p>
+      <w:r>
+        <w:t>' ============================</w:t>
+      </w:r>
+    </w:p>
+    <w:p>
+      <w:r>
+        <w:t>' Metrics Collection (Prometheus pulls /metrics)</w:t>
+      </w:r>
+    </w:p>
+    <w:p>
+      <w:r>
+        <w:t>' ============================</w:t>
+      </w:r>
+    </w:p>
+    <w:p>
+      <w:r>
+        <w:t xml:space="preserve">LB --&gt; </w:t>
+      </w:r>
+      <w:proofErr w:type="gramStart"/>
+      <w:r>
+        <w:t>Prom :</w:t>
+      </w:r>
+      <w:proofErr w:type="gramEnd"/>
+      <w:r>
+        <w:t xml:space="preserve"> "</w:t>
+      </w:r>
+      <w:proofErr w:type="spellStart"/>
+      <w:r>
+        <w:t>req_rate</w:t>
+      </w:r>
+      <w:proofErr w:type="spellEnd"/>
+      <w:r>
+        <w:t>, 5xx, latency"</w:t>
+      </w:r>
+    </w:p>
+    <w:p>
+      <w:r>
+        <w:t xml:space="preserve">FW --&gt; </w:t>
+      </w:r>
+      <w:proofErr w:type="gramStart"/>
+      <w:r>
+        <w:t>Prom :</w:t>
+      </w:r>
+      <w:proofErr w:type="gramEnd"/>
+      <w:r>
+        <w:t xml:space="preserve"> "</w:t>
+      </w:r>
+      <w:proofErr w:type="spellStart"/>
+      <w:r>
+        <w:t>blocked_requests</w:t>
+      </w:r>
+      <w:proofErr w:type="spellEnd"/>
+      <w:r>
+        <w:t xml:space="preserve">, </w:t>
+      </w:r>
+      <w:proofErr w:type="spellStart"/>
+      <w:r>
+        <w:t>anomaly_score</w:t>
+      </w:r>
+      <w:proofErr w:type="spellEnd"/>
+      <w:r>
+        <w:t>"</w:t>
+      </w:r>
+    </w:p>
+    <w:p>
+      <w:r>
+        <w:t xml:space="preserve">Gateway --&gt; </w:t>
+      </w:r>
+      <w:proofErr w:type="gramStart"/>
+      <w:r>
+        <w:t>Prom :</w:t>
+      </w:r>
+      <w:proofErr w:type="gramEnd"/>
+      <w:r>
+        <w:t xml:space="preserve"> "latency (p95, p99), </w:t>
+      </w:r>
+      <w:proofErr w:type="spellStart"/>
+      <w:r>
+        <w:t>rate_limit_hits</w:t>
+      </w:r>
+      <w:proofErr w:type="spellEnd"/>
+      <w:r>
+        <w:t xml:space="preserve">, </w:t>
+      </w:r>
+      <w:proofErr w:type="spellStart"/>
+      <w:r>
+        <w:t>jwt_errors</w:t>
+      </w:r>
+      <w:proofErr w:type="spellEnd"/>
+      <w:r>
+        <w:t>"</w:t>
+      </w:r>
+    </w:p>
+    <w:p>
+      <w:r>
+        <w:t xml:space="preserve">KSM --&gt; </w:t>
+      </w:r>
+      <w:proofErr w:type="gramStart"/>
+      <w:r>
+        <w:t>Prom :</w:t>
+      </w:r>
+      <w:proofErr w:type="gramEnd"/>
+      <w:r>
+        <w:t xml:space="preserve"> "k8s node/pod metrics, autoscaling events"</w:t>
+      </w:r>
+    </w:p>
+    <w:p>
+      <w:proofErr w:type="spellStart"/>
+      <w:r>
+        <w:t>NodeExp</w:t>
+      </w:r>
+      <w:proofErr w:type="spellEnd"/>
+      <w:r>
+        <w:t xml:space="preserve"> --&gt; </w:t>
+      </w:r>
+      <w:proofErr w:type="gramStart"/>
+      <w:r>
+        <w:t>Prom :</w:t>
+      </w:r>
+      <w:proofErr w:type="gramEnd"/>
+      <w:r>
+        <w:t xml:space="preserve"> "node CPU/memory/disk"</w:t>
+      </w:r>
+    </w:p>
+    <w:p>
+      <w:r>
+        <w:t xml:space="preserve">Cust --&gt; </w:t>
+      </w:r>
+      <w:proofErr w:type="gramStart"/>
+      <w:r>
+        <w:t>Prom :</w:t>
+      </w:r>
+      <w:proofErr w:type="gramEnd"/>
+      <w:r>
+        <w:t xml:space="preserve"> "</w:t>
+      </w:r>
+      <w:proofErr w:type="spellStart"/>
+      <w:r>
+        <w:t>register_failures</w:t>
+      </w:r>
+      <w:proofErr w:type="spellEnd"/>
+      <w:r>
+        <w:t xml:space="preserve">, </w:t>
+      </w:r>
+      <w:proofErr w:type="spellStart"/>
+      <w:r>
+        <w:t>login_latency</w:t>
+      </w:r>
+      <w:proofErr w:type="spellEnd"/>
+      <w:r>
+        <w:t xml:space="preserve">, </w:t>
+      </w:r>
+      <w:proofErr w:type="spellStart"/>
+      <w:r>
+        <w:t>wallet_balance</w:t>
+      </w:r>
+      <w:proofErr w:type="spellEnd"/>
+      <w:r>
+        <w:t>"</w:t>
+      </w:r>
+    </w:p>
+    <w:p>
+      <w:r>
+        <w:t xml:space="preserve">Rider --&gt; </w:t>
+      </w:r>
+      <w:proofErr w:type="gramStart"/>
+      <w:r>
+        <w:t>Prom :</w:t>
+      </w:r>
+      <w:proofErr w:type="gramEnd"/>
+      <w:r>
+        <w:t xml:space="preserve"> "</w:t>
+      </w:r>
+      <w:proofErr w:type="spellStart"/>
+      <w:r>
+        <w:t>approval_queue_size</w:t>
+      </w:r>
+      <w:proofErr w:type="spellEnd"/>
+      <w:r>
+        <w:t xml:space="preserve">, </w:t>
+      </w:r>
+      <w:proofErr w:type="spellStart"/>
+      <w:r>
+        <w:t>carried_cash</w:t>
+      </w:r>
+      <w:proofErr w:type="spellEnd"/>
+      <w:r>
+        <w:t>"</w:t>
+      </w:r>
+    </w:p>
+    <w:p>
+      <w:r>
+        <w:t xml:space="preserve">Order --&gt; </w:t>
+      </w:r>
+      <w:proofErr w:type="gramStart"/>
+      <w:r>
+        <w:t>Prom :</w:t>
+      </w:r>
+      <w:proofErr w:type="gramEnd"/>
+      <w:r>
+        <w:t xml:space="preserve"> "</w:t>
+      </w:r>
+      <w:proofErr w:type="spellStart"/>
+      <w:r>
+        <w:t>order_placement_rate</w:t>
+      </w:r>
+      <w:proofErr w:type="spellEnd"/>
+      <w:r>
+        <w:t xml:space="preserve">, </w:t>
+      </w:r>
+      <w:proofErr w:type="spellStart"/>
+      <w:r>
+        <w:t>split_order_count</w:t>
+      </w:r>
+      <w:proofErr w:type="spellEnd"/>
+      <w:r>
+        <w:t xml:space="preserve">, </w:t>
+      </w:r>
+      <w:proofErr w:type="spellStart"/>
+      <w:r>
+        <w:t>cancellation_rate</w:t>
+      </w:r>
+      <w:proofErr w:type="spellEnd"/>
+      <w:r>
+        <w:t>"</w:t>
+      </w:r>
+    </w:p>
+    <w:p>
+      <w:r>
+        <w:t xml:space="preserve">Trip --&gt; </w:t>
+      </w:r>
+      <w:proofErr w:type="gramStart"/>
+      <w:r>
+        <w:t>Prom :</w:t>
+      </w:r>
+      <w:proofErr w:type="gramEnd"/>
+      <w:r>
+        <w:t xml:space="preserve"> "</w:t>
+      </w:r>
+      <w:proofErr w:type="spellStart"/>
+      <w:r>
+        <w:t>live_location_updates</w:t>
+      </w:r>
+      <w:proofErr w:type="spellEnd"/>
+      <w:r>
+        <w:t xml:space="preserve">, </w:t>
+      </w:r>
+      <w:proofErr w:type="spellStart"/>
+      <w:r>
+        <w:t>route_calc_latency</w:t>
+      </w:r>
+      <w:proofErr w:type="spellEnd"/>
+      <w:r>
+        <w:t xml:space="preserve"> (NFR-02)"</w:t>
+      </w:r>
+    </w:p>
+    <w:p>
+      <w:r>
+        <w:t xml:space="preserve">Dispatch --&gt; </w:t>
+      </w:r>
+      <w:proofErr w:type="gramStart"/>
+      <w:r>
+        <w:t>Prom :</w:t>
+      </w:r>
+      <w:proofErr w:type="gramEnd"/>
+      <w:r>
+        <w:t xml:space="preserve"> "</w:t>
+      </w:r>
+      <w:proofErr w:type="spellStart"/>
+      <w:r>
+        <w:t>assignment_time</w:t>
+      </w:r>
+      <w:proofErr w:type="spellEnd"/>
+      <w:r>
+        <w:t xml:space="preserve">, </w:t>
+      </w:r>
+      <w:proofErr w:type="spellStart"/>
+      <w:r>
+        <w:t>escalation_rate</w:t>
+      </w:r>
+      <w:proofErr w:type="spellEnd"/>
+      <w:r>
+        <w:t xml:space="preserve"> (FR-RA-02)"</w:t>
+      </w:r>
+    </w:p>
+    <w:p>
+      <w:r>
+        <w:t xml:space="preserve">Product --&gt; </w:t>
+      </w:r>
+      <w:proofErr w:type="gramStart"/>
+      <w:r>
+        <w:t>Prom :</w:t>
+      </w:r>
+      <w:proofErr w:type="gramEnd"/>
+      <w:r>
+        <w:t xml:space="preserve"> "</w:t>
+      </w:r>
+      <w:proofErr w:type="spellStart"/>
+      <w:r>
+        <w:t>search_latency</w:t>
+      </w:r>
+      <w:proofErr w:type="spellEnd"/>
+      <w:r>
+        <w:t xml:space="preserve"> (NFR-01), </w:t>
+      </w:r>
+      <w:proofErr w:type="spellStart"/>
+      <w:r>
+        <w:t>stock_update_failures</w:t>
+      </w:r>
+      <w:proofErr w:type="spellEnd"/>
+      <w:r>
+        <w:t>"</w:t>
+      </w:r>
+    </w:p>
+    <w:p>
+      <w:r>
+        <w:t xml:space="preserve">Client --&gt; </w:t>
+      </w:r>
+      <w:proofErr w:type="gramStart"/>
+      <w:r>
+        <w:t>Prom :</w:t>
+      </w:r>
+      <w:proofErr w:type="gramEnd"/>
+      <w:r>
+        <w:t xml:space="preserve"> "</w:t>
+      </w:r>
+      <w:proofErr w:type="spellStart"/>
+      <w:r>
+        <w:t>config_change_frequency</w:t>
+      </w:r>
+      <w:proofErr w:type="spellEnd"/>
+      <w:r>
+        <w:t xml:space="preserve">, </w:t>
+      </w:r>
+      <w:proofErr w:type="spellStart"/>
+      <w:r>
+        <w:t>approval_vote_time</w:t>
+      </w:r>
+      <w:proofErr w:type="spellEnd"/>
+      <w:r>
+        <w:t>"</w:t>
+      </w:r>
+    </w:p>
+    <w:p>
+      <w:r>
+        <w:t xml:space="preserve">Finance --&gt; </w:t>
+      </w:r>
+      <w:proofErr w:type="gramStart"/>
+      <w:r>
+        <w:t>Prom :</w:t>
+      </w:r>
+      <w:proofErr w:type="gramEnd"/>
+      <w:r>
+        <w:t xml:space="preserve"> "</w:t>
+      </w:r>
+      <w:proofErr w:type="spellStart"/>
+      <w:r>
+        <w:t>profit_calculation_time</w:t>
+      </w:r>
+      <w:proofErr w:type="spellEnd"/>
+      <w:r>
+        <w:t xml:space="preserve">, </w:t>
+      </w:r>
+      <w:proofErr w:type="spellStart"/>
+      <w:r>
+        <w:t>app_treasure_balance</w:t>
+      </w:r>
+      <w:proofErr w:type="spellEnd"/>
+      <w:r>
+        <w:t>"</w:t>
+      </w:r>
+    </w:p>
+    <w:p>
+      <w:r>
+        <w:t xml:space="preserve">Payment --&gt; </w:t>
+      </w:r>
+      <w:proofErr w:type="gramStart"/>
+      <w:r>
+        <w:t>Prom :</w:t>
+      </w:r>
+      <w:proofErr w:type="gramEnd"/>
+      <w:r>
+        <w:t xml:space="preserve"> "</w:t>
+      </w:r>
+      <w:proofErr w:type="spellStart"/>
+      <w:r>
+        <w:t>payment_success_rate</w:t>
+      </w:r>
+      <w:proofErr w:type="spellEnd"/>
+      <w:r>
+        <w:t xml:space="preserve">, </w:t>
+      </w:r>
+      <w:proofErr w:type="spellStart"/>
+      <w:r>
+        <w:t>tokenization_errors</w:t>
+      </w:r>
+      <w:proofErr w:type="spellEnd"/>
+      <w:r>
+        <w:t xml:space="preserve"> (SEC-03)"</w:t>
+      </w:r>
+    </w:p>
+    <w:p>
+      <w:r>
+        <w:t xml:space="preserve">Discount --&gt; </w:t>
+      </w:r>
+      <w:proofErr w:type="gramStart"/>
+      <w:r>
+        <w:t>Prom :</w:t>
+      </w:r>
+      <w:proofErr w:type="gramEnd"/>
+      <w:r>
+        <w:t xml:space="preserve"> "</w:t>
+      </w:r>
+      <w:proofErr w:type="spellStart"/>
+      <w:r>
+        <w:t>discount_application_latency</w:t>
+      </w:r>
+      <w:proofErr w:type="spellEnd"/>
+      <w:r>
+        <w:t xml:space="preserve">, </w:t>
+      </w:r>
+      <w:proofErr w:type="spellStart"/>
+      <w:r>
+        <w:t>budget_exhausted</w:t>
+      </w:r>
+      <w:proofErr w:type="spellEnd"/>
+      <w:r>
+        <w:t>"</w:t>
+      </w:r>
+    </w:p>
+    <w:p>
+      <w:r>
+        <w:t xml:space="preserve">Notify --&gt; </w:t>
+      </w:r>
+      <w:proofErr w:type="gramStart"/>
+      <w:r>
+        <w:t>Prom :</w:t>
+      </w:r>
+      <w:proofErr w:type="gramEnd"/>
+      <w:r>
+        <w:t xml:space="preserve"> "</w:t>
+      </w:r>
+      <w:proofErr w:type="spellStart"/>
+      <w:r>
+        <w:t>email_sms_success_rate</w:t>
+      </w:r>
+      <w:proofErr w:type="spellEnd"/>
+      <w:r>
+        <w:t xml:space="preserve">, </w:t>
+      </w:r>
+      <w:proofErr w:type="spellStart"/>
+      <w:r>
+        <w:t>otp_delivery_time</w:t>
+      </w:r>
+      <w:proofErr w:type="spellEnd"/>
+      <w:r>
+        <w:t>"</w:t>
+      </w:r>
+    </w:p>
+    <w:p>
+      <w:r>
+        <w:t xml:space="preserve">Complaint --&gt; </w:t>
+      </w:r>
+      <w:proofErr w:type="gramStart"/>
+      <w:r>
+        <w:t>Prom :</w:t>
+      </w:r>
+      <w:proofErr w:type="gramEnd"/>
+      <w:r>
+        <w:t xml:space="preserve"> "</w:t>
+      </w:r>
+      <w:proofErr w:type="spellStart"/>
+      <w:r>
+        <w:t>complaint_resolution_time</w:t>
+      </w:r>
+      <w:proofErr w:type="spellEnd"/>
+      <w:r>
+        <w:t xml:space="preserve">, </w:t>
+      </w:r>
+      <w:proofErr w:type="spellStart"/>
+      <w:r>
+        <w:t>return_initiation_failures</w:t>
+      </w:r>
+      <w:proofErr w:type="spellEnd"/>
+      <w:r>
+        <w:t xml:space="preserve"> (UC16)"</w:t>
+      </w:r>
+    </w:p>
+    <w:p>
+      <w:r>
+        <w:t xml:space="preserve">Receipt --&gt; </w:t>
+      </w:r>
+      <w:proofErr w:type="gramStart"/>
+      <w:r>
+        <w:t>Prom :</w:t>
+      </w:r>
+      <w:proofErr w:type="gramEnd"/>
+      <w:r>
+        <w:t xml:space="preserve"> "</w:t>
+      </w:r>
+      <w:proofErr w:type="spellStart"/>
+      <w:r>
+        <w:t>receipt_generation_time</w:t>
+      </w:r>
+      <w:proofErr w:type="spellEnd"/>
+      <w:r>
+        <w:t>"</w:t>
+      </w:r>
+    </w:p>
+    <w:p>
+      <w:r>
+        <w:t xml:space="preserve">Scheduler --&gt; </w:t>
+      </w:r>
+      <w:proofErr w:type="gramStart"/>
+      <w:r>
+        <w:t>Prom :</w:t>
+      </w:r>
+      <w:proofErr w:type="gramEnd"/>
+      <w:r>
+        <w:t xml:space="preserve"> "</w:t>
+      </w:r>
+      <w:proofErr w:type="spellStart"/>
+      <w:r>
+        <w:t>job_success_rate</w:t>
+      </w:r>
+      <w:proofErr w:type="spellEnd"/>
+      <w:r>
+        <w:t xml:space="preserve">, </w:t>
+      </w:r>
+      <w:proofErr w:type="spellStart"/>
+      <w:r>
+        <w:t>job_duration_seconds</w:t>
+      </w:r>
+      <w:proofErr w:type="spellEnd"/>
+      <w:r>
+        <w:t>"</w:t>
+      </w:r>
+    </w:p>
+    <w:p>
+      <w:r>
+        <w:t xml:space="preserve">Postgres --&gt; </w:t>
+      </w:r>
+      <w:proofErr w:type="gramStart"/>
+      <w:r>
+        <w:t>Prom :</w:t>
+      </w:r>
+      <w:proofErr w:type="gramEnd"/>
+      <w:r>
+        <w:t xml:space="preserve"> "</w:t>
+      </w:r>
+      <w:proofErr w:type="spellStart"/>
+      <w:r>
+        <w:t>replication_lag</w:t>
+      </w:r>
+      <w:proofErr w:type="spellEnd"/>
+      <w:r>
+        <w:t xml:space="preserve">, deadlocks, connections, </w:t>
+      </w:r>
+      <w:proofErr w:type="spellStart"/>
+      <w:r>
+        <w:t>temp_files</w:t>
+      </w:r>
+      <w:proofErr w:type="spellEnd"/>
+      <w:r>
+        <w:t>"</w:t>
+      </w:r>
+    </w:p>
+    <w:p>
+      <w:r>
+        <w:t xml:space="preserve">Redis --&gt; </w:t>
+      </w:r>
+      <w:proofErr w:type="gramStart"/>
+      <w:r>
+        <w:t>Prom :</w:t>
+      </w:r>
+      <w:proofErr w:type="gramEnd"/>
+      <w:r>
+        <w:t xml:space="preserve"> "</w:t>
+      </w:r>
+      <w:proofErr w:type="spellStart"/>
+      <w:r>
+        <w:t>hit_rate</w:t>
+      </w:r>
+      <w:proofErr w:type="spellEnd"/>
+      <w:r>
+        <w:t xml:space="preserve">, </w:t>
+      </w:r>
+      <w:proofErr w:type="spellStart"/>
+      <w:r>
+        <w:t>memory_usage</w:t>
+      </w:r>
+      <w:proofErr w:type="spellEnd"/>
+      <w:r>
+        <w:t xml:space="preserve">, </w:t>
+      </w:r>
+      <w:proofErr w:type="spellStart"/>
+      <w:r>
+        <w:t>evicted_keys</w:t>
+      </w:r>
+      <w:proofErr w:type="spellEnd"/>
+      <w:r>
+        <w:t xml:space="preserve">, </w:t>
+      </w:r>
+      <w:proofErr w:type="spellStart"/>
+      <w:r>
+        <w:t>connected_clients</w:t>
+      </w:r>
+      <w:proofErr w:type="spellEnd"/>
+      <w:r>
+        <w:t>"</w:t>
+      </w:r>
+    </w:p>
+    <w:p>
+      <w:proofErr w:type="spellStart"/>
+      <w:r>
+        <w:t>AuditDB</w:t>
+      </w:r>
+      <w:proofErr w:type="spellEnd"/>
+      <w:r>
+        <w:t xml:space="preserve"> --&gt; </w:t>
+      </w:r>
+      <w:proofErr w:type="gramStart"/>
+      <w:r>
+        <w:t>Prom :</w:t>
+      </w:r>
+      <w:proofErr w:type="gramEnd"/>
+      <w:r>
+        <w:t xml:space="preserve"> "</w:t>
+      </w:r>
+      <w:proofErr w:type="spellStart"/>
+      <w:r>
+        <w:t>write_latency</w:t>
+      </w:r>
+      <w:proofErr w:type="spellEnd"/>
+      <w:r>
+        <w:t xml:space="preserve">, </w:t>
+      </w:r>
+      <w:proofErr w:type="spellStart"/>
+      <w:r>
+        <w:t>space_used</w:t>
+      </w:r>
+      <w:proofErr w:type="spellEnd"/>
+      <w:r>
+        <w:t xml:space="preserve">, </w:t>
+      </w:r>
+      <w:proofErr w:type="spellStart"/>
+      <w:r>
+        <w:t>hash_verification_failures</w:t>
+      </w:r>
+      <w:proofErr w:type="spellEnd"/>
+      <w:r>
+        <w:t>"</w:t>
+      </w:r>
+    </w:p>
+    <w:p>
+      <w:proofErr w:type="spellStart"/>
+      <w:r>
+        <w:t>EventBus</w:t>
+      </w:r>
+      <w:proofErr w:type="spellEnd"/>
+      <w:r>
+        <w:t xml:space="preserve"> --&gt; </w:t>
+      </w:r>
+      <w:proofErr w:type="gramStart"/>
+      <w:r>
+        <w:t>Prom :</w:t>
+      </w:r>
+      <w:proofErr w:type="gramEnd"/>
+      <w:r>
+        <w:t xml:space="preserve"> "</w:t>
+      </w:r>
+      <w:proofErr w:type="spellStart"/>
+      <w:r>
+        <w:t>lag_per_partition</w:t>
+      </w:r>
+      <w:proofErr w:type="spellEnd"/>
+      <w:r>
+        <w:t xml:space="preserve">, </w:t>
+      </w:r>
+      <w:proofErr w:type="spellStart"/>
+      <w:r>
+        <w:t>consumer_group_status</w:t>
+      </w:r>
+      <w:proofErr w:type="spellEnd"/>
+      <w:r>
+        <w:t xml:space="preserve">, </w:t>
+      </w:r>
+      <w:proofErr w:type="spellStart"/>
+      <w:r>
+        <w:t>dead_letter_count</w:t>
+      </w:r>
+      <w:proofErr w:type="spellEnd"/>
+      <w:r>
+        <w:t xml:space="preserve">, </w:t>
+      </w:r>
+      <w:proofErr w:type="spellStart"/>
+      <w:r>
+        <w:t>outbox_table_size</w:t>
+      </w:r>
+      <w:proofErr w:type="spellEnd"/>
+      <w:r>
+        <w:t>"</w:t>
+      </w:r>
+    </w:p>
+    <w:p>
+      <w:r>
+        <w:t xml:space="preserve">Storage --&gt; </w:t>
+      </w:r>
+      <w:proofErr w:type="gramStart"/>
+      <w:r>
+        <w:t>Prom :</w:t>
+      </w:r>
+      <w:proofErr w:type="gramEnd"/>
+      <w:r>
+        <w:t xml:space="preserve"> "</w:t>
+      </w:r>
+      <w:proofErr w:type="spellStart"/>
+      <w:r>
+        <w:t>upload_errors</w:t>
+      </w:r>
+      <w:proofErr w:type="spellEnd"/>
+      <w:r>
+        <w:t xml:space="preserve">, </w:t>
+      </w:r>
+      <w:proofErr w:type="spellStart"/>
+      <w:r>
+        <w:t>request_latency</w:t>
+      </w:r>
+      <w:proofErr w:type="spellEnd"/>
+      <w:r>
+        <w:t xml:space="preserve">, </w:t>
+      </w:r>
+      <w:proofErr w:type="spellStart"/>
+      <w:r>
+        <w:t>bucket_size</w:t>
+      </w:r>
+      <w:proofErr w:type="spellEnd"/>
+      <w:r>
+        <w:t>"</w:t>
+      </w:r>
+    </w:p>
+    <w:p>
+      <w:r>
+        <w:t xml:space="preserve">Maps --&gt; </w:t>
+      </w:r>
+      <w:proofErr w:type="gramStart"/>
+      <w:r>
+        <w:t>Prom :</w:t>
+      </w:r>
+      <w:proofErr w:type="gramEnd"/>
+      <w:r>
+        <w:t xml:space="preserve"> "</w:t>
+      </w:r>
+      <w:proofErr w:type="spellStart"/>
+      <w:r>
+        <w:t>api_error_rate</w:t>
+      </w:r>
+      <w:proofErr w:type="spellEnd"/>
+      <w:r>
+        <w:t xml:space="preserve">, </w:t>
+      </w:r>
+      <w:proofErr w:type="spellStart"/>
+      <w:r>
+        <w:t>quota_usage</w:t>
+      </w:r>
+      <w:proofErr w:type="spellEnd"/>
+      <w:r>
+        <w:t xml:space="preserve"> (synthetic probe)"</w:t>
+      </w:r>
+    </w:p>
+    <w:p>
+      <w:proofErr w:type="spellStart"/>
+      <w:r>
+        <w:t>PayExt</w:t>
+      </w:r>
+      <w:proofErr w:type="spellEnd"/>
+      <w:r>
+        <w:t xml:space="preserve"> --&gt; </w:t>
+      </w:r>
+      <w:proofErr w:type="gramStart"/>
+      <w:r>
+        <w:t>Prom :</w:t>
+      </w:r>
+      <w:proofErr w:type="gramEnd"/>
+      <w:r>
+        <w:t xml:space="preserve"> "</w:t>
+      </w:r>
+      <w:proofErr w:type="spellStart"/>
+      <w:r>
+        <w:t>transaction_failure_rate</w:t>
+      </w:r>
+      <w:proofErr w:type="spellEnd"/>
+      <w:r>
+        <w:t xml:space="preserve">, </w:t>
+      </w:r>
+      <w:proofErr w:type="spellStart"/>
+      <w:r>
+        <w:t>refund_success_rate</w:t>
+      </w:r>
+      <w:proofErr w:type="spellEnd"/>
+      <w:r>
+        <w:t xml:space="preserve"> (UC4, UC29)"</w:t>
+      </w:r>
+    </w:p>
+    <w:p>
+      <w:proofErr w:type="spellStart"/>
+      <w:r>
+        <w:t>MsgExt</w:t>
+      </w:r>
+      <w:proofErr w:type="spellEnd"/>
+      <w:r>
+        <w:t xml:space="preserve"> --&gt; </w:t>
+      </w:r>
+      <w:proofErr w:type="gramStart"/>
+      <w:r>
+        <w:t>Prom :</w:t>
+      </w:r>
+      <w:proofErr w:type="gramEnd"/>
+      <w:r>
+        <w:t xml:space="preserve"> "</w:t>
+      </w:r>
+      <w:proofErr w:type="spellStart"/>
+      <w:r>
+        <w:t>delivery_failure_rate</w:t>
+      </w:r>
+      <w:proofErr w:type="spellEnd"/>
+      <w:r>
+        <w:t xml:space="preserve"> (synthetic probe)"</w:t>
+      </w:r>
+    </w:p>
+    <w:p/>
+    <w:p>
+      <w:r>
+        <w:t>' ============================</w:t>
+      </w:r>
+    </w:p>
+    <w:p>
+      <w:r>
+        <w:t>' Health Checks (API Contract – /health, /ready)</w:t>
+      </w:r>
+    </w:p>
+    <w:p>
+      <w:r>
+        <w:t>' ============================</w:t>
+      </w:r>
+    </w:p>
+    <w:p>
+      <w:r>
+        <w:t xml:space="preserve">LB --&gt; </w:t>
+      </w:r>
+      <w:proofErr w:type="gramStart"/>
+      <w:r>
+        <w:t>Gateway :</w:t>
+      </w:r>
+      <w:proofErr w:type="gramEnd"/>
+      <w:r>
+        <w:t xml:space="preserve"> "HTTP GET /health"</w:t>
+      </w:r>
+    </w:p>
+    <w:p>
+      <w:r>
+        <w:t xml:space="preserve">Gateway --&gt; </w:t>
+      </w:r>
+      <w:proofErr w:type="gramStart"/>
+      <w:r>
+        <w:t>Cust :</w:t>
+      </w:r>
+      <w:proofErr w:type="gramEnd"/>
+      <w:r>
+        <w:t xml:space="preserve"> "pass-through"</w:t>
+      </w:r>
+    </w:p>
+    <w:p>
+      <w:r>
+        <w:t xml:space="preserve">Gateway --&gt; </w:t>
+      </w:r>
+      <w:proofErr w:type="gramStart"/>
+      <w:r>
+        <w:t>Order :</w:t>
+      </w:r>
+      <w:proofErr w:type="gramEnd"/>
+      <w:r>
+        <w:t xml:space="preserve"> "pass-through"</w:t>
+      </w:r>
+    </w:p>
+    <w:p>
+      <w:r>
+        <w:t xml:space="preserve">Cust --&gt; </w:t>
+      </w:r>
+      <w:proofErr w:type="gramStart"/>
+      <w:r>
+        <w:t>Prom :</w:t>
+      </w:r>
+      <w:proofErr w:type="gramEnd"/>
+      <w:r>
+        <w:t xml:space="preserve"> "</w:t>
+      </w:r>
+      <w:proofErr w:type="spellStart"/>
+      <w:r>
+        <w:t>health_check_status</w:t>
+      </w:r>
+      <w:proofErr w:type="spellEnd"/>
+      <w:r>
+        <w:t>"</w:t>
+      </w:r>
+    </w:p>
+    <w:p>
+      <w:r>
+        <w:t xml:space="preserve">Order --&gt; </w:t>
+      </w:r>
+      <w:proofErr w:type="gramStart"/>
+      <w:r>
+        <w:t>Prom :</w:t>
+      </w:r>
+      <w:proofErr w:type="gramEnd"/>
+      <w:r>
+        <w:t xml:space="preserve"> "</w:t>
+      </w:r>
+      <w:proofErr w:type="spellStart"/>
+      <w:r>
+        <w:t>health_check_status</w:t>
+      </w:r>
+      <w:proofErr w:type="spellEnd"/>
+      <w:r>
+        <w:t>"</w:t>
+      </w:r>
+    </w:p>
+    <w:p>
+      <w:r>
+        <w:t xml:space="preserve">Trip --&gt; </w:t>
+      </w:r>
+      <w:proofErr w:type="gramStart"/>
+      <w:r>
+        <w:t>Prom :</w:t>
+      </w:r>
+      <w:proofErr w:type="gramEnd"/>
+      <w:r>
+        <w:t xml:space="preserve"> "</w:t>
+      </w:r>
+      <w:proofErr w:type="spellStart"/>
+      <w:r>
+        <w:t>health_check_status</w:t>
+      </w:r>
+      <w:proofErr w:type="spellEnd"/>
+      <w:r>
+        <w:t>"</w:t>
+      </w:r>
+    </w:p>
+    <w:p>
+      <w:r>
+        <w:t>' Each service exposes /health and /ready endpoints per API contract.</w:t>
+      </w:r>
+    </w:p>
+    <w:p/>
+    <w:p>
+      <w:r>
+        <w:t>' ============================</w:t>
+      </w:r>
+    </w:p>
+    <w:p>
+      <w:r>
+        <w:t>' Synthetic Transactions (availability – NFR-08)</w:t>
+      </w:r>
+    </w:p>
+    <w:p>
+      <w:r>
+        <w:t>' ============================</w:t>
+      </w:r>
+    </w:p>
+    <w:p>
+      <w:r>
+        <w:t>note right of Prom</w:t>
+      </w:r>
+    </w:p>
+    <w:p>
+      <w:r>
+        <w:t xml:space="preserve">  **Synthetic monitoring (every 60 sec</w:t>
+      </w:r>
+      <w:proofErr w:type="gramStart"/>
+      <w:r>
+        <w:t>):*</w:t>
+      </w:r>
+      <w:proofErr w:type="gramEnd"/>
+      <w:r>
+        <w:t>*</w:t>
+      </w:r>
+    </w:p>
+    <w:p>
+      <w:r>
+        <w:t xml:space="preserve">  - Login (UC2) → POST /auth/login</w:t>
+      </w:r>
+    </w:p>
+    <w:p>
+      <w:r>
+        <w:t xml:space="preserve">  - Product search (UC1) → GET /</w:t>
+      </w:r>
+      <w:proofErr w:type="spellStart"/>
+      <w:r>
+        <w:t>products?q</w:t>
+      </w:r>
+      <w:proofErr w:type="spellEnd"/>
+      <w:r>
+        <w:t>=test</w:t>
+      </w:r>
+    </w:p>
+    <w:p>
+      <w:r>
+        <w:t xml:space="preserve">  - Add to cart (UC2a) → POST /cart/add</w:t>
+      </w:r>
+    </w:p>
+    <w:p>
+      <w:r>
+        <w:t xml:space="preserve">  - Checkout (UC3) → POST /order/checkout</w:t>
+      </w:r>
+    </w:p>
+    <w:p>
+      <w:r>
+        <w:t xml:space="preserve">  - Track order (UC5) → WebSocket connection</w:t>
+      </w:r>
+    </w:p>
+    <w:p>
+      <w:r>
+        <w:t xml:space="preserve">  - Place order with COD (UC4) → POST /order/pay</w:t>
+      </w:r>
+    </w:p>
+    <w:p>
+      <w:r>
+        <w:t xml:space="preserve">  - Call external Maps API (synthetic)</w:t>
+      </w:r>
+    </w:p>
+    <w:p>
+      <w:r>
+        <w:t xml:space="preserve">  - Call external Payment Gateway (synthetic health)</w:t>
+      </w:r>
+    </w:p>
+    <w:p>
+      <w:r>
+        <w:t xml:space="preserve">  - Call external SMS/Email (synthetic)</w:t>
+      </w:r>
+    </w:p>
+    <w:p>
+      <w:r>
+        <w:t xml:space="preserve">  Failures trigger critical alert.</w:t>
+      </w:r>
+    </w:p>
+    <w:p>
+      <w:r>
+        <w:t>end note</w:t>
+      </w:r>
+    </w:p>
+    <w:p/>
+    <w:p>
+      <w:r>
+        <w:t>' ============================</w:t>
+      </w:r>
+    </w:p>
+    <w:p>
+      <w:r>
+        <w:t xml:space="preserve">' Logs Collection (push via </w:t>
+      </w:r>
+      <w:proofErr w:type="spellStart"/>
+      <w:r>
+        <w:t>Filebeat</w:t>
+      </w:r>
+      <w:proofErr w:type="spellEnd"/>
+      <w:r>
+        <w:t xml:space="preserve"> – NFR-15)</w:t>
+      </w:r>
+    </w:p>
+    <w:p>
+      <w:r>
+        <w:t>' ============================</w:t>
+      </w:r>
+    </w:p>
+    <w:p>
+      <w:r>
+        <w:t xml:space="preserve">Gateway --&gt; </w:t>
+      </w:r>
+      <w:proofErr w:type="gramStart"/>
+      <w:r>
+        <w:t>ELK :</w:t>
+      </w:r>
+      <w:proofErr w:type="gramEnd"/>
+      <w:r>
+        <w:t xml:space="preserve"> "</w:t>
+      </w:r>
+      <w:proofErr w:type="spellStart"/>
+      <w:r>
+        <w:t>access_logs</w:t>
+      </w:r>
+      <w:proofErr w:type="spellEnd"/>
+      <w:r>
+        <w:t xml:space="preserve">, </w:t>
+      </w:r>
+      <w:proofErr w:type="spellStart"/>
+      <w:r>
+        <w:t>jwt_audit</w:t>
+      </w:r>
+      <w:proofErr w:type="spellEnd"/>
+      <w:r>
+        <w:t xml:space="preserve"> (SEC-09)"</w:t>
+      </w:r>
+    </w:p>
+    <w:p>
+      <w:r>
+        <w:t xml:space="preserve">Cust --&gt; </w:t>
+      </w:r>
+      <w:proofErr w:type="gramStart"/>
+      <w:r>
+        <w:t>ELK :</w:t>
+      </w:r>
+      <w:proofErr w:type="gramEnd"/>
+      <w:r>
+        <w:t xml:space="preserve"> "</w:t>
+      </w:r>
+      <w:proofErr w:type="spellStart"/>
+      <w:r>
+        <w:t>registration_events</w:t>
+      </w:r>
+      <w:proofErr w:type="spellEnd"/>
+      <w:r>
+        <w:t xml:space="preserve">, </w:t>
+      </w:r>
+      <w:proofErr w:type="spellStart"/>
+      <w:r>
+        <w:t>wallet_transactions</w:t>
+      </w:r>
+      <w:proofErr w:type="spellEnd"/>
+      <w:r>
+        <w:t>"</w:t>
+      </w:r>
+    </w:p>
+    <w:p>
+      <w:r>
+        <w:t xml:space="preserve">Order --&gt; </w:t>
+      </w:r>
+      <w:proofErr w:type="gramStart"/>
+      <w:r>
+        <w:t>ELK :</w:t>
+      </w:r>
+      <w:proofErr w:type="gramEnd"/>
+      <w:r>
+        <w:t xml:space="preserve"> "</w:t>
+      </w:r>
+      <w:proofErr w:type="spellStart"/>
+      <w:r>
+        <w:t>order_status_changes</w:t>
+      </w:r>
+      <w:proofErr w:type="spellEnd"/>
+      <w:r>
+        <w:t xml:space="preserve"> (FR-C-16)"</w:t>
+      </w:r>
+    </w:p>
+    <w:p>
+      <w:r>
+        <w:t xml:space="preserve">Payment --&gt; </w:t>
+      </w:r>
+      <w:proofErr w:type="gramStart"/>
+      <w:r>
+        <w:t>ELK :</w:t>
+      </w:r>
+      <w:proofErr w:type="gramEnd"/>
+      <w:r>
+        <w:t xml:space="preserve"> "</w:t>
+      </w:r>
+      <w:proofErr w:type="spellStart"/>
+      <w:r>
+        <w:t>payment_attempts</w:t>
+      </w:r>
+      <w:proofErr w:type="spellEnd"/>
+      <w:r>
+        <w:t xml:space="preserve"> (masked, no PAN - PCI DSS)"</w:t>
+      </w:r>
+    </w:p>
+    <w:p>
+      <w:r>
+        <w:t xml:space="preserve">Trip --&gt; </w:t>
+      </w:r>
+      <w:proofErr w:type="gramStart"/>
+      <w:r>
+        <w:t>ELK :</w:t>
+      </w:r>
+      <w:proofErr w:type="gramEnd"/>
+      <w:r>
+        <w:t xml:space="preserve"> "</w:t>
+      </w:r>
+      <w:proofErr w:type="spellStart"/>
+      <w:r>
+        <w:t>location_history</w:t>
+      </w:r>
+      <w:proofErr w:type="spellEnd"/>
+      <w:r>
+        <w:t xml:space="preserve"> (24h retention, SEC-21)"</w:t>
+      </w:r>
+    </w:p>
+    <w:p>
+      <w:r>
+        <w:t xml:space="preserve">Client --&gt; </w:t>
+      </w:r>
+      <w:proofErr w:type="gramStart"/>
+      <w:r>
+        <w:t>ELK :</w:t>
+      </w:r>
+      <w:proofErr w:type="gramEnd"/>
+      <w:r>
+        <w:t xml:space="preserve"> "</w:t>
+      </w:r>
+      <w:proofErr w:type="spellStart"/>
+      <w:r>
+        <w:t>admin_actions</w:t>
+      </w:r>
+      <w:proofErr w:type="spellEnd"/>
+      <w:r>
+        <w:t xml:space="preserve"> (audit, FR-CL-30)"</w:t>
+      </w:r>
+    </w:p>
+    <w:p>
+      <w:proofErr w:type="spellStart"/>
+      <w:r>
+        <w:t>AuditDB</w:t>
+      </w:r>
+      <w:proofErr w:type="spellEnd"/>
+      <w:r>
+        <w:t xml:space="preserve"> --&gt; </w:t>
+      </w:r>
+      <w:proofErr w:type="gramStart"/>
+      <w:r>
+        <w:t>ELK :</w:t>
+      </w:r>
+      <w:proofErr w:type="gramEnd"/>
+      <w:r>
+        <w:t xml:space="preserve"> "</w:t>
+      </w:r>
+      <w:proofErr w:type="spellStart"/>
+      <w:r>
+        <w:t>immutable_audit_events</w:t>
+      </w:r>
+      <w:proofErr w:type="spellEnd"/>
+      <w:r>
+        <w:t xml:space="preserve"> (SEC-24)"</w:t>
+      </w:r>
+    </w:p>
+    <w:p>
+      <w:proofErr w:type="spellStart"/>
+      <w:r>
+        <w:t>EventBus</w:t>
+      </w:r>
+      <w:proofErr w:type="spellEnd"/>
+      <w:r>
+        <w:t xml:space="preserve"> --&gt; </w:t>
+      </w:r>
+      <w:proofErr w:type="gramStart"/>
+      <w:r>
+        <w:t>ELK :</w:t>
+      </w:r>
+      <w:proofErr w:type="gramEnd"/>
+      <w:r>
+        <w:t xml:space="preserve"> "</w:t>
+      </w:r>
+      <w:proofErr w:type="spellStart"/>
+      <w:r>
+        <w:t>dead_letter_queue_events</w:t>
+      </w:r>
+      <w:proofErr w:type="spellEnd"/>
+      <w:r>
+        <w:t xml:space="preserve">, </w:t>
+      </w:r>
+      <w:proofErr w:type="spellStart"/>
+      <w:r>
+        <w:t>outbox_failures</w:t>
+      </w:r>
+      <w:proofErr w:type="spellEnd"/>
+      <w:r>
+        <w:t>"</w:t>
+      </w:r>
+    </w:p>
+    <w:p>
+      <w:r>
+        <w:t xml:space="preserve">Postgres --&gt; </w:t>
+      </w:r>
+      <w:proofErr w:type="gramStart"/>
+      <w:r>
+        <w:t>ELK :</w:t>
+      </w:r>
+      <w:proofErr w:type="gramEnd"/>
+      <w:r>
+        <w:t xml:space="preserve"> "</w:t>
+      </w:r>
+      <w:proofErr w:type="spellStart"/>
+      <w:r>
+        <w:t>error_logs</w:t>
+      </w:r>
+      <w:proofErr w:type="spellEnd"/>
+      <w:r>
+        <w:t xml:space="preserve">, </w:t>
+      </w:r>
+      <w:proofErr w:type="spellStart"/>
+      <w:r>
+        <w:t>slow_query_log</w:t>
+      </w:r>
+      <w:proofErr w:type="spellEnd"/>
+      <w:r>
+        <w:t xml:space="preserve"> (&gt;200ms)"</w:t>
+      </w:r>
+    </w:p>
+    <w:p>
+      <w:r>
+        <w:t xml:space="preserve">Redis --&gt; </w:t>
+      </w:r>
+      <w:proofErr w:type="gramStart"/>
+      <w:r>
+        <w:t>ELK :</w:t>
+      </w:r>
+      <w:proofErr w:type="gramEnd"/>
+      <w:r>
+        <w:t xml:space="preserve"> "</w:t>
+      </w:r>
+      <w:proofErr w:type="spellStart"/>
+      <w:r>
+        <w:t>slow_logs</w:t>
+      </w:r>
+      <w:proofErr w:type="spellEnd"/>
+      <w:r>
+        <w:t xml:space="preserve"> (&gt;100ms)"</w:t>
+      </w:r>
+    </w:p>
+    <w:p>
+      <w:r>
+        <w:t xml:space="preserve">Scheduler --&gt; </w:t>
+      </w:r>
+      <w:proofErr w:type="gramStart"/>
+      <w:r>
+        <w:t>ELK :</w:t>
+      </w:r>
+      <w:proofErr w:type="gramEnd"/>
+      <w:r>
+        <w:t xml:space="preserve"> "</w:t>
+      </w:r>
+      <w:proofErr w:type="spellStart"/>
+      <w:r>
+        <w:t>job_execution_logs</w:t>
+      </w:r>
+      <w:proofErr w:type="spellEnd"/>
+      <w:r>
+        <w:t>"</w:t>
+      </w:r>
+    </w:p>
+    <w:p/>
+    <w:p>
+      <w:r>
+        <w:t>' ============================</w:t>
+      </w:r>
+    </w:p>
+    <w:p>
+      <w:r>
+        <w:t>' Distributed Tracing (Jaeger – NFR-15)</w:t>
+      </w:r>
+    </w:p>
+    <w:p>
+      <w:r>
+        <w:t>' ============================</w:t>
+      </w:r>
+    </w:p>
+    <w:p>
+      <w:r>
+        <w:t xml:space="preserve">Gateway --&gt; </w:t>
+      </w:r>
+      <w:proofErr w:type="gramStart"/>
+      <w:r>
+        <w:t>Jaeger :</w:t>
+      </w:r>
+      <w:proofErr w:type="gramEnd"/>
+      <w:r>
+        <w:t xml:space="preserve"> "</w:t>
+      </w:r>
+      <w:proofErr w:type="spellStart"/>
+      <w:r>
+        <w:t>trace_id</w:t>
+      </w:r>
+      <w:proofErr w:type="spellEnd"/>
+      <w:r>
+        <w:t xml:space="preserve"> (HTTP headers, WebSocket frames)"</w:t>
+      </w:r>
+    </w:p>
+    <w:p>
+      <w:r>
+        <w:t xml:space="preserve">Order --&gt; </w:t>
+      </w:r>
+      <w:proofErr w:type="gramStart"/>
+      <w:r>
+        <w:t>Jaeger :</w:t>
+      </w:r>
+      <w:proofErr w:type="gramEnd"/>
+      <w:r>
+        <w:t xml:space="preserve"> "</w:t>
+      </w:r>
+      <w:proofErr w:type="spellStart"/>
+      <w:r>
+        <w:t>order_placement_trace</w:t>
+      </w:r>
+      <w:proofErr w:type="spellEnd"/>
+      <w:r>
+        <w:t xml:space="preserve"> (includes split orders - FR-C-08)"</w:t>
+      </w:r>
+    </w:p>
+    <w:p>
+      <w:r>
+        <w:t xml:space="preserve">Payment --&gt; </w:t>
+      </w:r>
+      <w:proofErr w:type="gramStart"/>
+      <w:r>
+        <w:t>Jaeger :</w:t>
+      </w:r>
+      <w:proofErr w:type="gramEnd"/>
+      <w:r>
+        <w:t xml:space="preserve"> "</w:t>
+      </w:r>
+      <w:proofErr w:type="spellStart"/>
+      <w:r>
+        <w:t>payment_flow_trace</w:t>
+      </w:r>
+      <w:proofErr w:type="spellEnd"/>
+      <w:r>
+        <w:t xml:space="preserve"> (</w:t>
+      </w:r>
+      <w:proofErr w:type="spellStart"/>
+      <w:r>
+        <w:t>tokenisation</w:t>
+      </w:r>
+      <w:proofErr w:type="spellEnd"/>
+      <w:r>
+        <w:t xml:space="preserve"> - SEC-03)"</w:t>
+      </w:r>
+    </w:p>
+    <w:p>
+      <w:r>
+        <w:t xml:space="preserve">Trip --&gt; </w:t>
+      </w:r>
+      <w:proofErr w:type="gramStart"/>
+      <w:r>
+        <w:t>Jaeger :</w:t>
+      </w:r>
+      <w:proofErr w:type="gramEnd"/>
+      <w:r>
+        <w:t xml:space="preserve"> "</w:t>
+      </w:r>
+      <w:proofErr w:type="spellStart"/>
+      <w:r>
+        <w:t>route_calculation_trace</w:t>
+      </w:r>
+      <w:proofErr w:type="spellEnd"/>
+      <w:r>
+        <w:t xml:space="preserve"> (Google Maps call latency)"</w:t>
+      </w:r>
+    </w:p>
+    <w:p>
+      <w:r>
+        <w:t xml:space="preserve">Dispatch --&gt; </w:t>
+      </w:r>
+      <w:proofErr w:type="gramStart"/>
+      <w:r>
+        <w:t>Jaeger :</w:t>
+      </w:r>
+      <w:proofErr w:type="gramEnd"/>
+      <w:r>
+        <w:t xml:space="preserve"> "</w:t>
+      </w:r>
+      <w:proofErr w:type="spellStart"/>
+      <w:r>
+        <w:t>assignment_trace</w:t>
+      </w:r>
+      <w:proofErr w:type="spellEnd"/>
+      <w:r>
+        <w:t xml:space="preserve"> (15</w:t>
+      </w:r>
+      <w:r>
+        <w:rPr>
+          <w:rFonts w:ascii="Cambria Math" w:hAnsi="Cambria Math" w:cs="Cambria Math"/>
+        </w:rPr>
+        <w:t>‑</w:t>
+      </w:r>
+      <w:r>
+        <w:t>min escalation - FR-RA-02)"</w:t>
+      </w:r>
+    </w:p>
+    <w:p>
+      <w:r>
+        <w:t xml:space="preserve">Client --&gt; </w:t>
+      </w:r>
+      <w:proofErr w:type="gramStart"/>
+      <w:r>
+        <w:t>Jaeger :</w:t>
+      </w:r>
+      <w:proofErr w:type="gramEnd"/>
+      <w:r>
+        <w:t xml:space="preserve"> "</w:t>
+      </w:r>
+      <w:proofErr w:type="spellStart"/>
+      <w:r>
+        <w:t>config_change_trace</w:t>
+      </w:r>
+      <w:proofErr w:type="spellEnd"/>
+      <w:r>
+        <w:t xml:space="preserve"> (unanimous approval - FR-CL-02)"</w:t>
+      </w:r>
+    </w:p>
+    <w:p>
+      <w:r>
+        <w:t xml:space="preserve">Complaint --&gt; </w:t>
+      </w:r>
+      <w:proofErr w:type="gramStart"/>
+      <w:r>
+        <w:t>Jaeger :</w:t>
+      </w:r>
+      <w:proofErr w:type="gramEnd"/>
+      <w:r>
+        <w:t xml:space="preserve"> "</w:t>
+      </w:r>
+      <w:proofErr w:type="spellStart"/>
+      <w:r>
+        <w:t>return_flow_trace</w:t>
+      </w:r>
+      <w:proofErr w:type="spellEnd"/>
+      <w:r>
+        <w:t xml:space="preserve"> (UC16 – return initiation, freeze/unfreeze)"</w:t>
+      </w:r>
+    </w:p>
+    <w:p>
+      <w:r>
+        <w:t xml:space="preserve">Discount --&gt; </w:t>
+      </w:r>
+      <w:proofErr w:type="gramStart"/>
+      <w:r>
+        <w:t>Jaeger :</w:t>
+      </w:r>
+      <w:proofErr w:type="gramEnd"/>
+      <w:r>
+        <w:t xml:space="preserve"> "</w:t>
+      </w:r>
+      <w:proofErr w:type="spellStart"/>
+      <w:r>
+        <w:t>discount_allocation_trace</w:t>
+      </w:r>
+      <w:proofErr w:type="spellEnd"/>
+      <w:r>
+        <w:t xml:space="preserve"> (FR-D-</w:t>
+      </w:r>
+      <w:proofErr w:type="gramStart"/>
+      <w:r>
+        <w:t>02..</w:t>
+      </w:r>
+      <w:proofErr w:type="gramEnd"/>
+      <w:r>
+        <w:t>05)"</w:t>
+      </w:r>
+    </w:p>
+    <w:p>
+      <w:r>
+        <w:t xml:space="preserve">Finance --&gt; </w:t>
+      </w:r>
+      <w:proofErr w:type="gramStart"/>
+      <w:r>
+        <w:t>Jaeger :</w:t>
+      </w:r>
+      <w:proofErr w:type="gramEnd"/>
+      <w:r>
+        <w:t xml:space="preserve"> "</w:t>
+      </w:r>
+      <w:proofErr w:type="spellStart"/>
+      <w:r>
+        <w:t>saga_orchestration_trace</w:t>
+      </w:r>
+      <w:proofErr w:type="spellEnd"/>
+      <w:r>
+        <w:t xml:space="preserve"> (e.g., order placement -&gt; payment -&gt; dispatch)"</w:t>
+      </w:r>
+    </w:p>
+    <w:p/>
+    <w:p>
+      <w:r>
+        <w:t>' ============================</w:t>
+      </w:r>
+    </w:p>
+    <w:p>
+      <w:r>
+        <w:t>' Alerting Rules (based on NFR, SEC, sequence diagrams)</w:t>
+      </w:r>
+    </w:p>
+    <w:p>
+      <w:r>
+        <w:t>' ============================</w:t>
+      </w:r>
+    </w:p>
+    <w:p>
+      <w:r>
+        <w:t xml:space="preserve">Prom --&gt; </w:t>
+      </w:r>
+      <w:proofErr w:type="gramStart"/>
+      <w:r>
+        <w:t>AM :</w:t>
+      </w:r>
+      <w:proofErr w:type="gramEnd"/>
+      <w:r>
+        <w:t xml:space="preserve"> "evaluate rules (every 30s)"</w:t>
+      </w:r>
+    </w:p>
+    <w:p>
+      <w:r>
+        <w:t xml:space="preserve">AM --&gt; </w:t>
+      </w:r>
+      <w:proofErr w:type="gramStart"/>
+      <w:r>
+        <w:t>PD :</w:t>
+      </w:r>
+      <w:proofErr w:type="gramEnd"/>
+      <w:r>
+        <w:t xml:space="preserve"> "critical alerts (PagerDuty), warning alerts (Slack)"</w:t>
+      </w:r>
+    </w:p>
+    <w:p>
+      <w:r>
+        <w:t xml:space="preserve">AM --&gt; </w:t>
+      </w:r>
+      <w:proofErr w:type="gramStart"/>
+      <w:r>
+        <w:t>Graf :</w:t>
+      </w:r>
+      <w:proofErr w:type="gramEnd"/>
+      <w:r>
+        <w:t xml:space="preserve"> "annotations for dashboards"</w:t>
+      </w:r>
+    </w:p>
+    <w:p/>
+    <w:p>
+      <w:r>
+        <w:t>note right of AM</w:t>
+      </w:r>
+    </w:p>
+    <w:p>
+      <w:r>
+        <w:t xml:space="preserve">  **Critical Alerts (page immediately</w:t>
+      </w:r>
+      <w:proofErr w:type="gramStart"/>
+      <w:r>
+        <w:t>):*</w:t>
+      </w:r>
+      <w:proofErr w:type="gramEnd"/>
+      <w:r>
+        <w:t>*</w:t>
+      </w:r>
+    </w:p>
+    <w:p>
+      <w:r>
+        <w:t xml:space="preserve">  - `up{job="</w:t>
+      </w:r>
+      <w:proofErr w:type="spellStart"/>
+      <w:r>
+        <w:t>api</w:t>
+      </w:r>
+      <w:proofErr w:type="spellEnd"/>
+      <w:r>
+        <w:t>-gateway"} == 0` → **critical** (NFR-08)</w:t>
+      </w:r>
+    </w:p>
+    <w:p>
+      <w:r>
+        <w:t xml:space="preserve">  - `rate(</w:t>
+      </w:r>
+      <w:proofErr w:type="spellStart"/>
+      <w:r>
+        <w:t>http_requests_total</w:t>
+      </w:r>
+      <w:proofErr w:type="spellEnd"/>
+      <w:r>
+        <w:t>{status=~"</w:t>
+      </w:r>
+      <w:proofErr w:type="gramStart"/>
+      <w:r>
+        <w:t>5.."}[</w:t>
+      </w:r>
+      <w:proofErr w:type="gramEnd"/>
+      <w:r>
+        <w:t>2m]) &gt; 0.05` → **critical** (NFR-08)</w:t>
+      </w:r>
+    </w:p>
+    <w:p>
+      <w:r>
+        <w:t xml:space="preserve">  - `</w:t>
+      </w:r>
+      <w:proofErr w:type="spellStart"/>
+      <w:r>
+        <w:t>payment_gateway_failure_rate</w:t>
+      </w:r>
+      <w:proofErr w:type="spellEnd"/>
+      <w:r>
+        <w:t xml:space="preserve"> &gt; 0.10` → **critical** (UC4, UC29)</w:t>
+      </w:r>
+    </w:p>
+    <w:p>
+      <w:r>
+        <w:t xml:space="preserve">  - `</w:t>
+      </w:r>
+      <w:proofErr w:type="spellStart"/>
+      <w:r>
+        <w:t>pg_replication_lag_seconds</w:t>
+      </w:r>
+      <w:proofErr w:type="spellEnd"/>
+      <w:r>
+        <w:t xml:space="preserve"> &gt; 30` → **critical**</w:t>
+      </w:r>
+    </w:p>
+    <w:p>
+      <w:r>
+        <w:t xml:space="preserve">  - `</w:t>
+      </w:r>
+      <w:proofErr w:type="spellStart"/>
+      <w:r>
+        <w:t>order_placement_failures_total</w:t>
+      </w:r>
+      <w:proofErr w:type="spellEnd"/>
+      <w:r>
+        <w:t>[5m] &gt; 5` → **critical** (UC3)</w:t>
+      </w:r>
+    </w:p>
+    <w:p>
+      <w:r>
+        <w:t xml:space="preserve">  - `</w:t>
+      </w:r>
+      <w:proofErr w:type="spellStart"/>
+      <w:r>
+        <w:t>backup_job_failed</w:t>
+      </w:r>
+      <w:proofErr w:type="spellEnd"/>
+      <w:r>
+        <w:t xml:space="preserve"> == 1` → **critical** (NFR-09)</w:t>
+      </w:r>
+    </w:p>
+    <w:p>
+      <w:r>
+        <w:t xml:space="preserve">  - `</w:t>
+      </w:r>
+      <w:proofErr w:type="spellStart"/>
+      <w:r>
+        <w:t>rate_limit_hit_total</w:t>
+      </w:r>
+      <w:proofErr w:type="spellEnd"/>
+      <w:r>
+        <w:t>[1m] &gt; 0.8 * limit` → **critical** (SEC-25)</w:t>
+      </w:r>
+    </w:p>
+    <w:p>
+      <w:r>
+        <w:t xml:space="preserve">  - `</w:t>
+      </w:r>
+      <w:proofErr w:type="spellStart"/>
+      <w:r>
+        <w:t>jwt_validation_errors_total</w:t>
+      </w:r>
+      <w:proofErr w:type="spellEnd"/>
+      <w:r>
+        <w:t>[1m] &gt; 20` → **critical** (SEC-09)</w:t>
+      </w:r>
+    </w:p>
+    <w:p>
+      <w:r>
+        <w:t xml:space="preserve">  - `</w:t>
+      </w:r>
+      <w:proofErr w:type="spellStart"/>
+      <w:r>
+        <w:t>certificate_expiry_days</w:t>
+      </w:r>
+      <w:proofErr w:type="spellEnd"/>
+      <w:r>
+        <w:t xml:space="preserve"> &lt; 7` → **critical** (SEC-02)</w:t>
+      </w:r>
+    </w:p>
+    <w:p>
+      <w:r>
+        <w:t xml:space="preserve">  - `</w:t>
+      </w:r>
+      <w:proofErr w:type="spellStart"/>
+      <w:r>
+        <w:t>price_update_approval_timeout_total</w:t>
+      </w:r>
+      <w:proofErr w:type="spellEnd"/>
+      <w:r>
+        <w:t>[5m] &gt; 2` → **critical** (UC14)</w:t>
+      </w:r>
+    </w:p>
+    <w:p>
+      <w:r>
+        <w:t xml:space="preserve">  - `</w:t>
+      </w:r>
+      <w:proofErr w:type="spellStart"/>
+      <w:r>
+        <w:t>return_freeze_unfreeze_failures_total</w:t>
+      </w:r>
+      <w:proofErr w:type="spellEnd"/>
+      <w:r>
+        <w:t>[5m] &gt; 0` → **critical** (UC16)</w:t>
+      </w:r>
+    </w:p>
+    <w:p>
+      <w:r>
+        <w:t xml:space="preserve">  - `</w:t>
+      </w:r>
+      <w:proofErr w:type="spellStart"/>
+      <w:r>
+        <w:t>complaint_resolution_timeout_total</w:t>
+      </w:r>
+      <w:proofErr w:type="spellEnd"/>
+      <w:r>
+        <w:t>[1h] &gt; 5` → **critical** (UC24)</w:t>
+      </w:r>
+    </w:p>
+    <w:p>
+      <w:r>
+        <w:t xml:space="preserve">  - `</w:t>
+      </w:r>
+      <w:proofErr w:type="spellStart"/>
+      <w:r>
+        <w:t>outbox_table_size</w:t>
+      </w:r>
+      <w:proofErr w:type="spellEnd"/>
+      <w:r>
+        <w:t xml:space="preserve"> &gt; 10000` → **critical** (potential event loss)</w:t>
+      </w:r>
+    </w:p>
+    <w:p>
+      <w:r>
+        <w:t xml:space="preserve">  - `</w:t>
+      </w:r>
+      <w:proofErr w:type="spellStart"/>
+      <w:r>
+        <w:t>app_treasure_balance</w:t>
+      </w:r>
+      <w:proofErr w:type="spellEnd"/>
+      <w:r>
+        <w:t xml:space="preserve"> &lt; 5000` → **critical** (insufficient funds for payouts/refunds)</w:t>
+      </w:r>
+    </w:p>
+    <w:p>
+      <w:r>
+        <w:t xml:space="preserve">  - `</w:t>
+      </w:r>
+      <w:proofErr w:type="spellStart"/>
+      <w:r>
+        <w:t>rider_deviation_proof_missing</w:t>
+      </w:r>
+      <w:proofErr w:type="spellEnd"/>
+      <w:r>
+        <w:t xml:space="preserve"> &gt; 1` (deviation &gt;24h) → **critical** (FR-R-07)</w:t>
+      </w:r>
+    </w:p>
+    <w:p/>
+    <w:p>
+      <w:r>
+        <w:t xml:space="preserve">  **Warning Alerts (Slack only</w:t>
+      </w:r>
+      <w:proofErr w:type="gramStart"/>
+      <w:r>
+        <w:t>):*</w:t>
+      </w:r>
+      <w:proofErr w:type="gramEnd"/>
+      <w:r>
+        <w:t>*</w:t>
+      </w:r>
+    </w:p>
+    <w:p>
+      <w:r>
+        <w:t xml:space="preserve">  - `</w:t>
+      </w:r>
+      <w:proofErr w:type="spellStart"/>
+      <w:r>
+        <w:t>histogram_</w:t>
+      </w:r>
+      <w:proofErr w:type="gramStart"/>
+      <w:r>
+        <w:t>quantile</w:t>
+      </w:r>
+      <w:proofErr w:type="spellEnd"/>
+      <w:r>
+        <w:t>(</w:t>
+      </w:r>
+      <w:proofErr w:type="gramEnd"/>
+      <w:r>
+        <w:t xml:space="preserve">0.95, </w:t>
+      </w:r>
+      <w:proofErr w:type="spellStart"/>
+      <w:r>
+        <w:t>http_request_duration_seconds</w:t>
+      </w:r>
+      <w:proofErr w:type="spellEnd"/>
+      <w:r>
+        <w:t>) &gt; 0.5` (5 min) → warning (NFR-01)</w:t>
+      </w:r>
+    </w:p>
+    <w:p>
+      <w:r>
+        <w:t xml:space="preserve">  - `</w:t>
+      </w:r>
+      <w:proofErr w:type="spellStart"/>
+      <w:r>
+        <w:t>live_location_latency_seconds</w:t>
+      </w:r>
+      <w:proofErr w:type="spellEnd"/>
+      <w:r>
+        <w:t xml:space="preserve"> &gt; 1` (1 min) → warning (NFR-03)</w:t>
+      </w:r>
+    </w:p>
+    <w:p>
+      <w:r>
+        <w:t xml:space="preserve">  - `</w:t>
+      </w:r>
+      <w:proofErr w:type="spellStart"/>
+      <w:r>
+        <w:t>kafka_consumer_lag</w:t>
+      </w:r>
+      <w:proofErr w:type="spellEnd"/>
+      <w:r>
+        <w:t xml:space="preserve"> &gt; 1000` → warning (NFR-07)</w:t>
+      </w:r>
+    </w:p>
+    <w:p>
+      <w:r>
+        <w:t xml:space="preserve">  - `</w:t>
+      </w:r>
+      <w:proofErr w:type="spellStart"/>
+      <w:r>
+        <w:t>failed_logins_total</w:t>
+      </w:r>
+      <w:proofErr w:type="spellEnd"/>
+      <w:r>
+        <w:t>[1m] &gt; 5` → warning (SEC-11)</w:t>
+      </w:r>
+    </w:p>
+    <w:p>
+      <w:r>
+        <w:t xml:space="preserve">  - `</w:t>
+      </w:r>
+      <w:proofErr w:type="spellStart"/>
+      <w:r>
+        <w:t>redis_memory_usage_bytes</w:t>
+      </w:r>
+      <w:proofErr w:type="spellEnd"/>
+      <w:r>
+        <w:t xml:space="preserve"> / </w:t>
+      </w:r>
+      <w:proofErr w:type="spellStart"/>
+      <w:r>
+        <w:t>redis_maxmemory_bytes</w:t>
+      </w:r>
+      <w:proofErr w:type="spellEnd"/>
+      <w:r>
+        <w:t xml:space="preserve"> &gt; 0.85` → warning</w:t>
+      </w:r>
+    </w:p>
+    <w:p>
+      <w:r>
+        <w:t xml:space="preserve">  - `</w:t>
+      </w:r>
+      <w:proofErr w:type="spellStart"/>
+      <w:r>
+        <w:t>kube_pod_container_status_restarts_total</w:t>
+      </w:r>
+      <w:proofErr w:type="spellEnd"/>
+      <w:r>
+        <w:t>[10m] &gt; 5` → warning</w:t>
+      </w:r>
+    </w:p>
+    <w:p>
+      <w:r>
+        <w:t xml:space="preserve">  - `</w:t>
+      </w:r>
+      <w:proofErr w:type="spellStart"/>
+      <w:r>
+        <w:t>complaint_rate_total</w:t>
+      </w:r>
+      <w:proofErr w:type="spellEnd"/>
+      <w:r>
+        <w:t>[1h] &gt; 10` → warning</w:t>
+      </w:r>
+    </w:p>
+    <w:p>
+      <w:r>
+        <w:t xml:space="preserve">  - `</w:t>
+      </w:r>
+      <w:proofErr w:type="spellStart"/>
+      <w:r>
+        <w:t>dispatch_escalation_rate_total</w:t>
+      </w:r>
+      <w:proofErr w:type="spellEnd"/>
+      <w:r>
+        <w:t>[1h] &gt; 20` → warning (FR-RA-02)</w:t>
+      </w:r>
+    </w:p>
+    <w:p>
+      <w:r>
+        <w:t xml:space="preserve">  - `</w:t>
+      </w:r>
+      <w:proofErr w:type="spellStart"/>
+      <w:r>
+        <w:t>discount_event_budget_exhausted</w:t>
+      </w:r>
+      <w:proofErr w:type="spellEnd"/>
+      <w:r>
+        <w:t xml:space="preserve"> == 1` → warning (FR-D-04)</w:t>
+      </w:r>
+    </w:p>
+    <w:p>
+      <w:r>
+        <w:t xml:space="preserve">  - `</w:t>
+      </w:r>
+      <w:proofErr w:type="spellStart"/>
+      <w:r>
+        <w:t>job_failure_rate_total</w:t>
+      </w:r>
+      <w:proofErr w:type="spellEnd"/>
+      <w:r>
+        <w:t>[1h] &gt; 0.1` → warning (scheduler)</w:t>
+      </w:r>
+    </w:p>
+    <w:p>
+      <w:r>
+        <w:t xml:space="preserve">  - `</w:t>
+      </w:r>
+      <w:proofErr w:type="spellStart"/>
+      <w:r>
+        <w:t>saga_execution_time_seconds</w:t>
+      </w:r>
+      <w:proofErr w:type="spellEnd"/>
+      <w:r>
+        <w:t xml:space="preserve"> &gt; 30` → warning (long</w:t>
+      </w:r>
+      <w:r>
+        <w:rPr>
+          <w:rFonts w:ascii="Cambria Math" w:hAnsi="Cambria Math" w:cs="Cambria Math"/>
+        </w:rPr>
+        <w:t>‑</w:t>
+      </w:r>
+      <w:r>
+        <w:t>running transaction)</w:t>
+      </w:r>
+    </w:p>
+    <w:p>
+      <w:r>
+        <w:t xml:space="preserve">  - `</w:t>
+      </w:r>
+      <w:proofErr w:type="spellStart"/>
+      <w:r>
+        <w:t>order_stuck_in_assigned_state</w:t>
+      </w:r>
+      <w:proofErr w:type="spellEnd"/>
+      <w:r>
+        <w:t xml:space="preserve"> &gt; 10min` → warning (potential rider assignment issue)</w:t>
+      </w:r>
+    </w:p>
+    <w:p>
+      <w:r>
+        <w:t xml:space="preserve">  - `</w:t>
+      </w:r>
+      <w:proofErr w:type="spellStart"/>
+      <w:r>
+        <w:t>age_verification_failure_rate</w:t>
+      </w:r>
+      <w:proofErr w:type="spellEnd"/>
+      <w:r>
+        <w:t xml:space="preserve"> &gt; 0.05` → warning (NFR-19)</w:t>
+      </w:r>
+    </w:p>
+    <w:p/>
+    <w:p>
+      <w:r>
+        <w:t xml:space="preserve">  **Info Alerts (dashboard only</w:t>
+      </w:r>
+      <w:proofErr w:type="gramStart"/>
+      <w:r>
+        <w:t>):*</w:t>
+      </w:r>
+      <w:proofErr w:type="gramEnd"/>
+      <w:r>
+        <w:t>*</w:t>
+      </w:r>
+    </w:p>
+    <w:p>
+      <w:r>
+        <w:t xml:space="preserve">  - `</w:t>
+      </w:r>
+      <w:proofErr w:type="spellStart"/>
+      <w:r>
+        <w:t>discount_event_active</w:t>
+      </w:r>
+      <w:proofErr w:type="spellEnd"/>
+      <w:r>
+        <w:t xml:space="preserve"> == 1`</w:t>
+      </w:r>
+    </w:p>
+    <w:p>
+      <w:r>
+        <w:t xml:space="preserve">  - `</w:t>
+      </w:r>
+      <w:proofErr w:type="spellStart"/>
+      <w:r>
+        <w:t>deprecated_api_calls_total</w:t>
+      </w:r>
+      <w:proofErr w:type="spellEnd"/>
+      <w:r>
+        <w:t xml:space="preserve"> &gt; 0`</w:t>
+      </w:r>
+    </w:p>
+    <w:p>
+      <w:r>
+        <w:t xml:space="preserve">  - `</w:t>
+      </w:r>
+      <w:proofErr w:type="spellStart"/>
+      <w:r>
+        <w:t>order_split_count_total</w:t>
+      </w:r>
+      <w:proofErr w:type="spellEnd"/>
+      <w:r>
+        <w:t>[1h] &gt; 100` (FR-C-08)</w:t>
+      </w:r>
+    </w:p>
+    <w:p>
+      <w:r>
+        <w:t>end note</w:t>
+      </w:r>
+    </w:p>
+    <w:p/>
+    <w:p>
+      <w:r>
+        <w:t>' ============================</w:t>
+      </w:r>
+    </w:p>
+    <w:p>
+      <w:r>
+        <w:t>' Service Level Objectives (SLOs) – based on NFR-08</w:t>
+      </w:r>
+    </w:p>
+    <w:p>
+      <w:r>
+        <w:t>' ============================</w:t>
+      </w:r>
+    </w:p>
+    <w:p>
+      <w:r>
+        <w:t>note right of Graf</w:t>
+      </w:r>
+    </w:p>
+    <w:p>
+      <w:r>
+        <w:t xml:space="preserve">  **SLOs (99.9% uptime for ordering/payment</w:t>
+      </w:r>
+      <w:proofErr w:type="gramStart"/>
+      <w:r>
+        <w:t>):*</w:t>
+      </w:r>
+      <w:proofErr w:type="gramEnd"/>
+      <w:r>
+        <w:t>*</w:t>
+      </w:r>
+    </w:p>
+    <w:p>
+      <w:r>
+        <w:t xml:space="preserve">  - </w:t>
+      </w:r>
+      <w:proofErr w:type="gramStart"/>
+      <w:r>
+        <w:t>`(</w:t>
+      </w:r>
+      <w:proofErr w:type="gramEnd"/>
+      <w:r>
+        <w:t xml:space="preserve">1 - </w:t>
+      </w:r>
+      <w:proofErr w:type="spellStart"/>
+      <w:r>
+        <w:t>error_</w:t>
+      </w:r>
+      <w:proofErr w:type="gramStart"/>
+      <w:r>
+        <w:t>budget</w:t>
+      </w:r>
+      <w:proofErr w:type="spellEnd"/>
+      <w:r>
+        <w:t>)`</w:t>
+      </w:r>
+      <w:proofErr w:type="gramEnd"/>
+      <w:r>
+        <w:t xml:space="preserve"> tracked via `</w:t>
+      </w:r>
+      <w:proofErr w:type="spellStart"/>
+      <w:r>
+        <w:t>sli_availability</w:t>
+      </w:r>
+      <w:proofErr w:type="spellEnd"/>
+      <w:r>
+        <w:t>`</w:t>
+      </w:r>
+    </w:p>
+    <w:p>
+      <w:r>
+        <w:t xml:space="preserve">  - Burn rate alerts when error budget consumed quickly</w:t>
+      </w:r>
+    </w:p>
+    <w:p>
+      <w:r>
+        <w:t>end note</w:t>
+      </w:r>
+    </w:p>
+    <w:p/>
+    <w:p>
+      <w:r>
+        <w:t>' ============================</w:t>
+      </w:r>
+    </w:p>
+    <w:p>
+      <w:r>
+        <w:t>' PCI DSS Specific Monitoring (SEC-</w:t>
+      </w:r>
+      <w:proofErr w:type="gramStart"/>
+      <w:r>
+        <w:t>01..</w:t>
+      </w:r>
+      <w:proofErr w:type="gramEnd"/>
+      <w:r>
+        <w:t>06)</w:t>
+      </w:r>
+    </w:p>
+    <w:p>
+      <w:r>
+        <w:t>' ============================</w:t>
+      </w:r>
+    </w:p>
+    <w:p>
+      <w:r>
+        <w:t>note right of Payment</w:t>
+      </w:r>
+    </w:p>
+    <w:p>
+      <w:r>
+        <w:t xml:space="preserve">  **PCI DSS controls </w:t>
+      </w:r>
+      <w:proofErr w:type="gramStart"/>
+      <w:r>
+        <w:t>monitored:*</w:t>
+      </w:r>
+      <w:proofErr w:type="gramEnd"/>
+      <w:r>
+        <w:t>*</w:t>
+      </w:r>
+    </w:p>
+    <w:p>
+      <w:r>
+        <w:t xml:space="preserve">  - Any `PAN` or `CVV` in logs → **immediate critical alert + auto-redaction**</w:t>
+      </w:r>
+    </w:p>
+    <w:p>
+      <w:r>
+        <w:t xml:space="preserve">  - Token generation failure rate &gt;5% → **critical alert** (SEC-03)</w:t>
+      </w:r>
+    </w:p>
+    <w:p>
+      <w:r>
+        <w:t xml:space="preserve">  - </w:t>
+      </w:r>
+      <w:proofErr w:type="spellStart"/>
+      <w:r>
+        <w:t>Unauthorised</w:t>
+      </w:r>
+      <w:proofErr w:type="spellEnd"/>
+      <w:r>
+        <w:t xml:space="preserve"> access to token store → **audit &amp; alert** (SEC-18)</w:t>
+      </w:r>
+    </w:p>
+    <w:p>
+      <w:r>
+        <w:t xml:space="preserve">  - TLS version &lt; 1.3 on any endpoint → **critical alert** (SEC-02)</w:t>
+      </w:r>
+    </w:p>
+    <w:p>
+      <w:r>
+        <w:t xml:space="preserve">  - Payment card data flow (PCI DFD) – ensure no data enters backend</w:t>
+      </w:r>
+    </w:p>
+    <w:p>
+      <w:r>
+        <w:t>end note</w:t>
+      </w:r>
+    </w:p>
+    <w:p/>
+    <w:p>
+      <w:r>
+        <w:t>' ============================</w:t>
+      </w:r>
+    </w:p>
+    <w:p>
+      <w:r>
+        <w:t>' User Access (Dashboards)</w:t>
+      </w:r>
+    </w:p>
+    <w:p>
+      <w:r>
+        <w:t>' ============================</w:t>
+      </w:r>
+    </w:p>
+    <w:p>
+      <w:r>
+        <w:t>actor "DevOps / SRE" as DevOps</w:t>
+      </w:r>
+    </w:p>
+    <w:p>
+      <w:r>
+        <w:t xml:space="preserve">actor "Security Officer" as </w:t>
+      </w:r>
+      <w:proofErr w:type="spellStart"/>
+      <w:r>
+        <w:t>SecOff</w:t>
+      </w:r>
+      <w:proofErr w:type="spellEnd"/>
+    </w:p>
+    <w:p>
+      <w:r>
+        <w:t>actor "Business Analyst" as BA</w:t>
+      </w:r>
+    </w:p>
+    <w:p/>
+    <w:p>
+      <w:r>
+        <w:t xml:space="preserve">DevOps --&gt; </w:t>
+      </w:r>
+      <w:proofErr w:type="gramStart"/>
+      <w:r>
+        <w:t>Graf :</w:t>
+      </w:r>
+      <w:proofErr w:type="gramEnd"/>
+      <w:r>
+        <w:t xml:space="preserve"> "view dashboards (metrics, alerts)"</w:t>
+      </w:r>
+    </w:p>
+    <w:p>
+      <w:r>
+        <w:t xml:space="preserve">DevOps --&gt; </w:t>
+      </w:r>
+      <w:proofErr w:type="gramStart"/>
+      <w:r>
+        <w:t>ELK :</w:t>
+      </w:r>
+      <w:proofErr w:type="gramEnd"/>
+      <w:r>
+        <w:t xml:space="preserve"> "search logs (filtered by </w:t>
+      </w:r>
+      <w:proofErr w:type="spellStart"/>
+      <w:r>
+        <w:t>trace_id</w:t>
+      </w:r>
+      <w:proofErr w:type="spellEnd"/>
+      <w:r>
+        <w:t>, service)"</w:t>
+      </w:r>
+    </w:p>
+    <w:p>
+      <w:r>
+        <w:t xml:space="preserve">DevOps --&gt; </w:t>
+      </w:r>
+      <w:proofErr w:type="gramStart"/>
+      <w:r>
+        <w:t>Jaeger :</w:t>
+      </w:r>
+      <w:proofErr w:type="gramEnd"/>
+      <w:r>
+        <w:t xml:space="preserve"> "trace analysis (root cause)"</w:t>
+      </w:r>
+    </w:p>
+    <w:p>
+      <w:proofErr w:type="spellStart"/>
+      <w:r>
+        <w:t>SecOff</w:t>
+      </w:r>
+      <w:proofErr w:type="spellEnd"/>
+      <w:r>
+        <w:t xml:space="preserve"> --&gt; </w:t>
+      </w:r>
+      <w:proofErr w:type="gramStart"/>
+      <w:r>
+        <w:t>ELK :</w:t>
+      </w:r>
+      <w:proofErr w:type="gramEnd"/>
+      <w:r>
+        <w:t xml:space="preserve"> "audit log queries (read</w:t>
+      </w:r>
+      <w:r>
+        <w:rPr>
+          <w:rFonts w:ascii="Cambria Math" w:hAnsi="Cambria Math" w:cs="Cambria Math"/>
+        </w:rPr>
+        <w:t>‑</w:t>
+      </w:r>
+      <w:r>
+        <w:t>only, 1 year retention)"</w:t>
+      </w:r>
+    </w:p>
+    <w:p>
+      <w:proofErr w:type="spellStart"/>
+      <w:r>
+        <w:t>SecOff</w:t>
+      </w:r>
+      <w:proofErr w:type="spellEnd"/>
+      <w:r>
+        <w:t xml:space="preserve"> --&gt; </w:t>
+      </w:r>
+      <w:proofErr w:type="gramStart"/>
+      <w:r>
+        <w:t>Graf :</w:t>
+      </w:r>
+      <w:proofErr w:type="gramEnd"/>
+      <w:r>
+        <w:t xml:space="preserve"> "security dashboards (failed logins, rate limits, PCI alerts)"</w:t>
+      </w:r>
+    </w:p>
+    <w:p>
+      <w:r>
+        <w:t xml:space="preserve">BA --&gt; </w:t>
+      </w:r>
+      <w:proofErr w:type="gramStart"/>
+      <w:r>
+        <w:t>Graf :</w:t>
+      </w:r>
+      <w:proofErr w:type="gramEnd"/>
+      <w:r>
+        <w:t xml:space="preserve"> "business dashboards (orders, revenue, complaint rate)"</w:t>
+      </w:r>
+    </w:p>
+    <w:p/>
+    <w:p>
+      <w:r>
+        <w:t>' ============================</w:t>
+      </w:r>
+    </w:p>
+    <w:p>
+      <w:r>
+        <w:t>' Data Retention &amp; Compliance (SRS &amp; SEC)</w:t>
+      </w:r>
+    </w:p>
+    <w:p>
+      <w:r>
+        <w:t>' ============================</w:t>
+      </w:r>
+    </w:p>
+    <w:p>
+      <w:r>
+        <w:t>note right of ELK</w:t>
+      </w:r>
+    </w:p>
+    <w:p>
+      <w:r>
+        <w:t xml:space="preserve">  **Log retention (NFR-15, SEC-24</w:t>
+      </w:r>
+      <w:proofErr w:type="gramStart"/>
+      <w:r>
+        <w:t>):*</w:t>
+      </w:r>
+      <w:proofErr w:type="gramEnd"/>
+      <w:r>
+        <w:t>*</w:t>
+      </w:r>
+    </w:p>
+    <w:p>
+      <w:r>
+        <w:t xml:space="preserve">  - Application logs: 30 days (rotated daily)</w:t>
+      </w:r>
+    </w:p>
+    <w:p>
+      <w:r>
+        <w:t xml:space="preserve">  - Audit logs (from </w:t>
+      </w:r>
+      <w:proofErr w:type="spellStart"/>
+      <w:r>
+        <w:t>AuditDB</w:t>
+      </w:r>
+      <w:proofErr w:type="spellEnd"/>
+      <w:r>
+        <w:t>): **1 year minimum**</w:t>
+      </w:r>
+    </w:p>
+    <w:p>
+      <w:r>
+        <w:t xml:space="preserve">  - Payment logs: no PAN, only tokens + last4 (masked)</w:t>
+      </w:r>
+    </w:p>
+    <w:p>
+      <w:r>
+        <w:t xml:space="preserve">  - Live location logs: **24 hours** (SEC-21)</w:t>
+      </w:r>
+    </w:p>
+    <w:p>
+      <w:r>
+        <w:t xml:space="preserve">  - All logs structured JSON, indexed by service and severity</w:t>
+      </w:r>
+    </w:p>
+    <w:p>
+      <w:r>
+        <w:t>end note</w:t>
+      </w:r>
+    </w:p>
+    <w:p/>
+    <w:p>
+      <w:r>
+        <w:t>note left of Prom</w:t>
+      </w:r>
+    </w:p>
+    <w:p>
+      <w:r>
+        <w:t xml:space="preserve">  **Metrics </w:t>
+      </w:r>
+      <w:proofErr w:type="gramStart"/>
+      <w:r>
+        <w:t>retention:*</w:t>
+      </w:r>
+      <w:proofErr w:type="gramEnd"/>
+      <w:r>
+        <w:t>*</w:t>
+      </w:r>
+    </w:p>
+    <w:p>
+      <w:r>
+        <w:t xml:space="preserve">  - Prometheus local: 15 days at 15s scrape interval</w:t>
+      </w:r>
+    </w:p>
+    <w:p>
+      <w:r>
+        <w:t xml:space="preserve">  - Long</w:t>
+      </w:r>
+      <w:r>
+        <w:rPr>
+          <w:rFonts w:ascii="Cambria Math" w:hAnsi="Cambria Math" w:cs="Cambria Math"/>
+        </w:rPr>
+        <w:t>‑</w:t>
+      </w:r>
+      <w:r>
+        <w:t xml:space="preserve">term archival: Thanos / </w:t>
+      </w:r>
+      <w:proofErr w:type="spellStart"/>
+      <w:r>
+        <w:t>VictoriaMetrics</w:t>
+      </w:r>
+      <w:proofErr w:type="spellEnd"/>
+      <w:r>
+        <w:t xml:space="preserve"> (optional)</w:t>
+      </w:r>
+    </w:p>
+    <w:p>
+      <w:r>
+        <w:t xml:space="preserve">  - Historical business metrics: exported to data warehouse (e.g., </w:t>
+      </w:r>
+      <w:proofErr w:type="spellStart"/>
+      <w:r>
+        <w:t>BigQuery</w:t>
+      </w:r>
+      <w:proofErr w:type="spellEnd"/>
+      <w:r>
+        <w:t>)</w:t>
+      </w:r>
+    </w:p>
+    <w:p>
+      <w:r>
+        <w:t>end note</w:t>
+      </w:r>
+    </w:p>
+    <w:p/>
+    <w:p>
+      <w:r>
+        <w:t>@enduml</w:t>
+      </w:r>
+    </w:p>
     <w:p/>
     <w:sectPr>
       <w:pgSz w:w="12240" w:h="15840"/>

</xml_diff>